<commit_message>
Adding more API to the endpoint plan
</commit_message>
<xml_diff>
--- a/API Endpoint Plan.docx
+++ b/API Endpoint Plan.docx
@@ -2914,6 +2914,392 @@
           <w:p>
             <w:r>
               <w:t>404 Not Found - Enrolment ID invalid.</w:t>
+            </w:r>
+          </w:p>
+        </w:tc>
+      </w:tr>
+      <w:tr>
+        <w:trPr>
+          <w:tblCellSpacing w:w="15" w:type="dxa"/>
+        </w:trPr>
+        <w:tc>
+          <w:tcPr>
+            <w:tcW w:w="0" w:type="auto"/>
+            <w:tcBorders>
+              <w:top w:val="single" w:sz="6" w:space="0" w:color="C4C7C5"/>
+              <w:left w:val="single" w:sz="6" w:space="0" w:color="C4C7C5"/>
+              <w:bottom w:val="single" w:sz="6" w:space="0" w:color="C4C7C5"/>
+              <w:right w:val="single" w:sz="6" w:space="0" w:color="C4C7C5"/>
+            </w:tcBorders>
+            <w:tcMar>
+              <w:top w:w="120" w:type="dxa"/>
+              <w:left w:w="180" w:type="dxa"/>
+              <w:bottom w:w="120" w:type="dxa"/>
+              <w:right w:w="180" w:type="dxa"/>
+            </w:tcMar>
+            <w:vAlign w:val="center"/>
+          </w:tcPr>
+          <w:p>
+            <w:pPr>
+              <w:rPr>
+                <w:b/>
+                <w:bCs/>
+              </w:rPr>
+            </w:pPr>
+            <w:r>
+              <w:rPr>
+                <w:b/>
+                <w:bCs/>
+              </w:rPr>
+              <w:t>Get</w:t>
+            </w:r>
+          </w:p>
+        </w:tc>
+        <w:tc>
+          <w:tcPr>
+            <w:tcW w:w="0" w:type="auto"/>
+            <w:tcBorders>
+              <w:top w:val="single" w:sz="6" w:space="0" w:color="C4C7C5"/>
+              <w:left w:val="single" w:sz="6" w:space="0" w:color="C4C7C5"/>
+              <w:bottom w:val="single" w:sz="6" w:space="0" w:color="C4C7C5"/>
+              <w:right w:val="single" w:sz="6" w:space="0" w:color="C4C7C5"/>
+            </w:tcBorders>
+            <w:tcMar>
+              <w:top w:w="120" w:type="dxa"/>
+              <w:left w:w="180" w:type="dxa"/>
+              <w:bottom w:w="120" w:type="dxa"/>
+              <w:right w:w="180" w:type="dxa"/>
+            </w:tcMar>
+            <w:vAlign w:val="center"/>
+          </w:tcPr>
+          <w:p>
+            <w:r>
+              <w:t>/</w:t>
+            </w:r>
+            <w:proofErr w:type="spellStart"/>
+            <w:r>
+              <w:t>api</w:t>
+            </w:r>
+            <w:proofErr w:type="spellEnd"/>
+            <w:r>
+              <w:t>/results/my</w:t>
+            </w:r>
+            <w:r>
+              <w:t xml:space="preserve"> </w:t>
+            </w:r>
+            <w:r>
+              <w:t>results</w:t>
+            </w:r>
+          </w:p>
+        </w:tc>
+        <w:tc>
+          <w:tcPr>
+            <w:tcW w:w="0" w:type="auto"/>
+            <w:tcBorders>
+              <w:top w:val="single" w:sz="6" w:space="0" w:color="C4C7C5"/>
+              <w:left w:val="single" w:sz="6" w:space="0" w:color="C4C7C5"/>
+              <w:bottom w:val="single" w:sz="6" w:space="0" w:color="C4C7C5"/>
+              <w:right w:val="single" w:sz="6" w:space="0" w:color="C4C7C5"/>
+            </w:tcBorders>
+            <w:tcMar>
+              <w:top w:w="120" w:type="dxa"/>
+              <w:left w:w="180" w:type="dxa"/>
+              <w:bottom w:w="120" w:type="dxa"/>
+              <w:right w:w="180" w:type="dxa"/>
+            </w:tcMar>
+            <w:vAlign w:val="center"/>
+          </w:tcPr>
+          <w:p>
+            <w:r>
+              <w:t>Retr</w:t>
+            </w:r>
+            <w:r>
+              <w:t>ieves the personal race history and results for the authenticated participant</w:t>
+            </w:r>
+          </w:p>
+        </w:tc>
+        <w:tc>
+          <w:tcPr>
+            <w:tcW w:w="0" w:type="auto"/>
+            <w:tcBorders>
+              <w:top w:val="single" w:sz="6" w:space="0" w:color="C4C7C5"/>
+              <w:left w:val="single" w:sz="6" w:space="0" w:color="C4C7C5"/>
+              <w:bottom w:val="single" w:sz="6" w:space="0" w:color="C4C7C5"/>
+              <w:right w:val="single" w:sz="6" w:space="0" w:color="C4C7C5"/>
+            </w:tcBorders>
+            <w:tcMar>
+              <w:top w:w="120" w:type="dxa"/>
+              <w:left w:w="180" w:type="dxa"/>
+              <w:bottom w:w="120" w:type="dxa"/>
+              <w:right w:w="180" w:type="dxa"/>
+            </w:tcMar>
+            <w:vAlign w:val="center"/>
+          </w:tcPr>
+          <w:p>
+            <w:r>
+              <w:t>Participant</w:t>
+            </w:r>
+          </w:p>
+        </w:tc>
+        <w:tc>
+          <w:tcPr>
+            <w:tcW w:w="0" w:type="auto"/>
+            <w:tcBorders>
+              <w:top w:val="single" w:sz="6" w:space="0" w:color="C4C7C5"/>
+              <w:left w:val="single" w:sz="6" w:space="0" w:color="C4C7C5"/>
+              <w:bottom w:val="single" w:sz="6" w:space="0" w:color="C4C7C5"/>
+              <w:right w:val="single" w:sz="6" w:space="0" w:color="C4C7C5"/>
+            </w:tcBorders>
+            <w:tcMar>
+              <w:top w:w="120" w:type="dxa"/>
+              <w:left w:w="180" w:type="dxa"/>
+              <w:bottom w:w="120" w:type="dxa"/>
+              <w:right w:w="180" w:type="dxa"/>
+            </w:tcMar>
+            <w:vAlign w:val="center"/>
+          </w:tcPr>
+          <w:p>
+            <w:r>
+              <w:t>None</w:t>
+            </w:r>
+          </w:p>
+        </w:tc>
+        <w:tc>
+          <w:tcPr>
+            <w:tcW w:w="0" w:type="auto"/>
+            <w:tcBorders>
+              <w:top w:val="single" w:sz="6" w:space="0" w:color="C4C7C5"/>
+              <w:left w:val="single" w:sz="6" w:space="0" w:color="C4C7C5"/>
+              <w:bottom w:val="single" w:sz="6" w:space="0" w:color="C4C7C5"/>
+              <w:right w:val="single" w:sz="6" w:space="0" w:color="C4C7C5"/>
+            </w:tcBorders>
+            <w:tcMar>
+              <w:top w:w="120" w:type="dxa"/>
+              <w:left w:w="180" w:type="dxa"/>
+              <w:bottom w:w="120" w:type="dxa"/>
+              <w:right w:w="180" w:type="dxa"/>
+            </w:tcMar>
+            <w:vAlign w:val="center"/>
+          </w:tcPr>
+          <w:p>
+            <w:r>
+              <w:t>200 Ok – List of Historical race results</w:t>
+            </w:r>
+          </w:p>
+          <w:p>
+            <w:r>
+              <w:t xml:space="preserve">401 Unauthorized. </w:t>
+            </w:r>
+          </w:p>
+        </w:tc>
+      </w:tr>
+      <w:tr>
+        <w:trPr>
+          <w:tblCellSpacing w:w="15" w:type="dxa"/>
+        </w:trPr>
+        <w:tc>
+          <w:tcPr>
+            <w:tcW w:w="0" w:type="auto"/>
+            <w:tcBorders>
+              <w:top w:val="single" w:sz="6" w:space="0" w:color="C4C7C5"/>
+              <w:left w:val="single" w:sz="6" w:space="0" w:color="C4C7C5"/>
+              <w:bottom w:val="single" w:sz="6" w:space="0" w:color="C4C7C5"/>
+              <w:right w:val="single" w:sz="6" w:space="0" w:color="C4C7C5"/>
+            </w:tcBorders>
+            <w:tcMar>
+              <w:top w:w="120" w:type="dxa"/>
+              <w:left w:w="180" w:type="dxa"/>
+              <w:bottom w:w="120" w:type="dxa"/>
+              <w:right w:w="180" w:type="dxa"/>
+            </w:tcMar>
+            <w:vAlign w:val="center"/>
+          </w:tcPr>
+          <w:p>
+            <w:pPr>
+              <w:rPr>
+                <w:b/>
+                <w:bCs/>
+              </w:rPr>
+            </w:pPr>
+            <w:r>
+              <w:rPr>
+                <w:b/>
+                <w:bCs/>
+              </w:rPr>
+              <w:t>GET</w:t>
+            </w:r>
+          </w:p>
+        </w:tc>
+        <w:tc>
+          <w:tcPr>
+            <w:tcW w:w="0" w:type="auto"/>
+            <w:tcBorders>
+              <w:top w:val="single" w:sz="6" w:space="0" w:color="C4C7C5"/>
+              <w:left w:val="single" w:sz="6" w:space="0" w:color="C4C7C5"/>
+              <w:bottom w:val="single" w:sz="6" w:space="0" w:color="C4C7C5"/>
+              <w:right w:val="single" w:sz="6" w:space="0" w:color="C4C7C5"/>
+            </w:tcBorders>
+            <w:tcMar>
+              <w:top w:w="120" w:type="dxa"/>
+              <w:left w:w="180" w:type="dxa"/>
+              <w:bottom w:w="120" w:type="dxa"/>
+              <w:right w:w="180" w:type="dxa"/>
+            </w:tcMar>
+            <w:vAlign w:val="center"/>
+          </w:tcPr>
+          <w:p>
+            <w:r>
+              <w:t>/</w:t>
+            </w:r>
+            <w:proofErr w:type="spellStart"/>
+            <w:proofErr w:type="gramStart"/>
+            <w:r>
+              <w:t>api</w:t>
+            </w:r>
+            <w:proofErr w:type="spellEnd"/>
+            <w:proofErr w:type="gramEnd"/>
+            <w:r>
+              <w:t>/events</w:t>
+            </w:r>
+            <w:r>
+              <w:t>/{eventide</w:t>
+            </w:r>
+            <w:r>
+              <w:t>}</w:t>
+            </w:r>
+            <w:r>
+              <w:t>/route</w:t>
+            </w:r>
+          </w:p>
+        </w:tc>
+        <w:tc>
+          <w:tcPr>
+            <w:tcW w:w="0" w:type="auto"/>
+            <w:tcBorders>
+              <w:top w:val="single" w:sz="6" w:space="0" w:color="C4C7C5"/>
+              <w:left w:val="single" w:sz="6" w:space="0" w:color="C4C7C5"/>
+              <w:bottom w:val="single" w:sz="6" w:space="0" w:color="C4C7C5"/>
+              <w:right w:val="single" w:sz="6" w:space="0" w:color="C4C7C5"/>
+            </w:tcBorders>
+            <w:tcMar>
+              <w:top w:w="120" w:type="dxa"/>
+              <w:left w:w="180" w:type="dxa"/>
+              <w:bottom w:w="120" w:type="dxa"/>
+              <w:right w:w="180" w:type="dxa"/>
+            </w:tcMar>
+            <w:vAlign w:val="center"/>
+          </w:tcPr>
+          <w:p>
+            <w:r>
+              <w:t>Retri</w:t>
+            </w:r>
+            <w:r>
+              <w:t>e</w:t>
+            </w:r>
+            <w:r>
+              <w:t>ves route map coordinates, elevation</w:t>
+            </w:r>
+            <w:r>
+              <w:t xml:space="preserve"> profile and water point for the event.</w:t>
+            </w:r>
+          </w:p>
+        </w:tc>
+        <w:tc>
+          <w:tcPr>
+            <w:tcW w:w="0" w:type="auto"/>
+            <w:tcBorders>
+              <w:top w:val="single" w:sz="6" w:space="0" w:color="C4C7C5"/>
+              <w:left w:val="single" w:sz="6" w:space="0" w:color="C4C7C5"/>
+              <w:bottom w:val="single" w:sz="6" w:space="0" w:color="C4C7C5"/>
+              <w:right w:val="single" w:sz="6" w:space="0" w:color="C4C7C5"/>
+            </w:tcBorders>
+            <w:tcMar>
+              <w:top w:w="120" w:type="dxa"/>
+              <w:left w:w="180" w:type="dxa"/>
+              <w:bottom w:w="120" w:type="dxa"/>
+              <w:right w:w="180" w:type="dxa"/>
+            </w:tcMar>
+            <w:vAlign w:val="center"/>
+          </w:tcPr>
+          <w:p>
+            <w:r>
+              <w:t>Any</w:t>
+            </w:r>
+          </w:p>
+        </w:tc>
+        <w:tc>
+          <w:tcPr>
+            <w:tcW w:w="0" w:type="auto"/>
+            <w:tcBorders>
+              <w:top w:val="single" w:sz="6" w:space="0" w:color="C4C7C5"/>
+              <w:left w:val="single" w:sz="6" w:space="0" w:color="C4C7C5"/>
+              <w:bottom w:val="single" w:sz="6" w:space="0" w:color="C4C7C5"/>
+              <w:right w:val="single" w:sz="6" w:space="0" w:color="C4C7C5"/>
+            </w:tcBorders>
+            <w:tcMar>
+              <w:top w:w="120" w:type="dxa"/>
+              <w:left w:w="180" w:type="dxa"/>
+              <w:bottom w:w="120" w:type="dxa"/>
+              <w:right w:w="180" w:type="dxa"/>
+            </w:tcMar>
+            <w:vAlign w:val="center"/>
+          </w:tcPr>
+          <w:p>
+            <w:r>
+              <w:t>None</w:t>
+            </w:r>
+          </w:p>
+        </w:tc>
+        <w:tc>
+          <w:tcPr>
+            <w:tcW w:w="0" w:type="auto"/>
+            <w:tcBorders>
+              <w:top w:val="single" w:sz="6" w:space="0" w:color="C4C7C5"/>
+              <w:left w:val="single" w:sz="6" w:space="0" w:color="C4C7C5"/>
+              <w:bottom w:val="single" w:sz="6" w:space="0" w:color="C4C7C5"/>
+              <w:right w:val="single" w:sz="6" w:space="0" w:color="C4C7C5"/>
+            </w:tcBorders>
+            <w:tcMar>
+              <w:top w:w="120" w:type="dxa"/>
+              <w:left w:w="180" w:type="dxa"/>
+              <w:bottom w:w="120" w:type="dxa"/>
+              <w:right w:w="180" w:type="dxa"/>
+            </w:tcMar>
+            <w:vAlign w:val="center"/>
+          </w:tcPr>
+          <w:p>
+            <w:r>
+              <w:t xml:space="preserve">200 Ok </w:t>
+            </w:r>
+            <w:r>
+              <w:t>–</w:t>
+            </w:r>
+            <w:r>
+              <w:t xml:space="preserve"> </w:t>
+            </w:r>
+            <w:r>
+              <w:t xml:space="preserve">Route GIS and </w:t>
+            </w:r>
+            <w:r>
+              <w:t>elevation data.</w:t>
+            </w:r>
+          </w:p>
+          <w:p>
+            <w:r>
+              <w:t xml:space="preserve"> </w:t>
+            </w:r>
+            <w:r>
+              <w:t xml:space="preserve">404 Not Found- Route </w:t>
+            </w:r>
+            <w:r>
+              <w:lastRenderedPageBreak/>
+              <w:t>Unavail</w:t>
+            </w:r>
+            <w:r>
+              <w:t>a</w:t>
+            </w:r>
+            <w:r>
+              <w:t xml:space="preserve">ble </w:t>
             </w:r>
           </w:p>
         </w:tc>

</xml_diff>

<commit_message>
Completed Api Endpoint Plan and Added Race Day SQL
</commit_message>
<xml_diff>
--- a/API Endpoint Plan.docx
+++ b/API Endpoint Plan.docx
@@ -8,116 +8,6 @@
       </w:pPr>
       <w:r>
         <w:t>API Endpoint Plan</w:t>
-      </w:r>
-    </w:p>
-    <w:p>
-      <w:r>
-        <w:t>q, w, e, r, t, y</w:t>
-      </w:r>
-    </w:p>
-    <w:p>
-      <w:r>
-        <w:t>a, l</w:t>
-      </w:r>
-      <w:proofErr w:type="gramStart"/>
-      <w:r>
-        <w:t>, ,</w:t>
-      </w:r>
-      <w:proofErr w:type="gramEnd"/>
-      <w:r>
-        <w:t xml:space="preserve"> </w:t>
-      </w:r>
-      <w:proofErr w:type="gramStart"/>
-      <w:r>
-        <w:t>, ,</w:t>
-      </w:r>
-      <w:proofErr w:type="gramEnd"/>
-      <w:r>
-        <w:t xml:space="preserve"> </w:t>
-      </w:r>
-    </w:p>
-    <w:p>
-      <w:r>
-        <w:t>s</w:t>
-      </w:r>
-      <w:proofErr w:type="gramStart"/>
-      <w:r>
-        <w:t>, ,</w:t>
-      </w:r>
-      <w:proofErr w:type="gramEnd"/>
-      <w:r>
-        <w:t xml:space="preserve"> </w:t>
-      </w:r>
-      <w:proofErr w:type="gramStart"/>
-      <w:r>
-        <w:t>, ,</w:t>
-      </w:r>
-      <w:proofErr w:type="gramEnd"/>
-      <w:r>
-        <w:t xml:space="preserve"> , </w:t>
-      </w:r>
-    </w:p>
-    <w:p>
-      <w:r>
-        <w:t>d</w:t>
-      </w:r>
-      <w:proofErr w:type="gramStart"/>
-      <w:r>
-        <w:t>, ,</w:t>
-      </w:r>
-      <w:proofErr w:type="gramEnd"/>
-      <w:r>
-        <w:t xml:space="preserve"> </w:t>
-      </w:r>
-      <w:proofErr w:type="gramStart"/>
-      <w:r>
-        <w:t>, ,</w:t>
-      </w:r>
-      <w:proofErr w:type="gramEnd"/>
-      <w:r>
-        <w:t xml:space="preserve"> , </w:t>
-      </w:r>
-    </w:p>
-    <w:p>
-      <w:r>
-        <w:t>f</w:t>
-      </w:r>
-      <w:proofErr w:type="gramStart"/>
-      <w:r>
-        <w:t>, ,</w:t>
-      </w:r>
-      <w:proofErr w:type="gramEnd"/>
-      <w:r>
-        <w:t xml:space="preserve"> </w:t>
-      </w:r>
-      <w:proofErr w:type="gramStart"/>
-      <w:r>
-        <w:t>, ,</w:t>
-      </w:r>
-      <w:proofErr w:type="gramEnd"/>
-      <w:r>
-        <w:t xml:space="preserve"> , </w:t>
-      </w:r>
-    </w:p>
-    <w:p>
-      <w:r>
-        <w:t>g</w:t>
-      </w:r>
-      <w:proofErr w:type="gramStart"/>
-      <w:r>
-        <w:t>, ,</w:t>
-      </w:r>
-      <w:proofErr w:type="gramEnd"/>
-      <w:r>
-        <w:t xml:space="preserve"> </w:t>
-      </w:r>
-      <w:proofErr w:type="gramStart"/>
-      <w:r>
-        <w:t>, ,</w:t>
-      </w:r>
-      <w:proofErr w:type="gramEnd"/>
-      <w:r>
-        <w:t xml:space="preserve"> , </w:t>
       </w:r>
     </w:p>
     <w:p/>
@@ -134,12 +24,12 @@
         <w:tblLook w:val="04A0" w:firstRow="1" w:lastRow="0" w:firstColumn="1" w:lastColumn="0" w:noHBand="0" w:noVBand="1"/>
       </w:tblPr>
       <w:tblGrid>
-        <w:gridCol w:w="915"/>
-        <w:gridCol w:w="2404"/>
-        <w:gridCol w:w="1782"/>
-        <w:gridCol w:w="1054"/>
-        <w:gridCol w:w="1396"/>
-        <w:gridCol w:w="1459"/>
+        <w:gridCol w:w="1525"/>
+        <w:gridCol w:w="3443"/>
+        <w:gridCol w:w="2894"/>
+        <w:gridCol w:w="1625"/>
+        <w:gridCol w:w="2210"/>
+        <w:gridCol w:w="2245"/>
       </w:tblGrid>
       <w:tr>
         <w:trPr>
@@ -165,11 +55,10 @@
             <w:hideMark/>
           </w:tcPr>
           <w:p>
-            <w:r>
-              <w:rPr>
-                <w:b/>
-                <w:bCs/>
-              </w:rPr>
+            <w:pPr>
+              <w:pStyle w:val="Heading2"/>
+            </w:pPr>
+            <w:r>
               <w:t>HTTP Method</w:t>
             </w:r>
           </w:p>
@@ -193,11 +82,10 @@
             <w:hideMark/>
           </w:tcPr>
           <w:p>
-            <w:r>
-              <w:rPr>
-                <w:b/>
-                <w:bCs/>
-              </w:rPr>
+            <w:pPr>
+              <w:pStyle w:val="Heading2"/>
+            </w:pPr>
+            <w:r>
               <w:t>Route</w:t>
             </w:r>
           </w:p>
@@ -221,11 +109,10 @@
             <w:hideMark/>
           </w:tcPr>
           <w:p>
-            <w:r>
-              <w:rPr>
-                <w:b/>
-                <w:bCs/>
-              </w:rPr>
+            <w:pPr>
+              <w:pStyle w:val="Heading2"/>
+            </w:pPr>
+            <w:r>
               <w:t>Description</w:t>
             </w:r>
           </w:p>
@@ -249,11 +136,10 @@
             <w:hideMark/>
           </w:tcPr>
           <w:p>
-            <w:r>
-              <w:rPr>
-                <w:b/>
-                <w:bCs/>
-              </w:rPr>
+            <w:pPr>
+              <w:pStyle w:val="Heading2"/>
+            </w:pPr>
+            <w:r>
               <w:t>Role Required</w:t>
             </w:r>
           </w:p>
@@ -277,11 +163,10 @@
             <w:hideMark/>
           </w:tcPr>
           <w:p>
-            <w:r>
-              <w:rPr>
-                <w:b/>
-                <w:bCs/>
-              </w:rPr>
+            <w:pPr>
+              <w:pStyle w:val="Heading2"/>
+            </w:pPr>
+            <w:r>
               <w:t>Request Body</w:t>
             </w:r>
           </w:p>
@@ -305,11 +190,10 @@
             <w:hideMark/>
           </w:tcPr>
           <w:p>
-            <w:r>
-              <w:rPr>
-                <w:b/>
-                <w:bCs/>
-              </w:rPr>
+            <w:pPr>
+              <w:pStyle w:val="Heading2"/>
+            </w:pPr>
+            <w:r>
               <w:t>Expected Response</w:t>
             </w:r>
           </w:p>
@@ -690,11 +574,7 @@
           </w:p>
           <w:p>
             <w:r>
-              <w:t xml:space="preserve">401 Unauthorized - Invalid </w:t>
-            </w:r>
-            <w:r>
-              <w:lastRenderedPageBreak/>
-              <w:t>credentials.</w:t>
+              <w:t>401 Unauthorized - Invalid credentials.</w:t>
             </w:r>
           </w:p>
         </w:tc>
@@ -1254,6 +1134,7 @@
                 <w:b/>
                 <w:bCs/>
               </w:rPr>
+              <w:lastRenderedPageBreak/>
               <w:t>GET</w:t>
             </w:r>
           </w:p>
@@ -1394,8 +1275,947 @@
           </w:p>
           <w:p>
             <w:r>
+              <w:t>404 Not Found - Event does not exist.</w:t>
+            </w:r>
+          </w:p>
+        </w:tc>
+      </w:tr>
+      <w:tr>
+        <w:trPr>
+          <w:tblCellSpacing w:w="15" w:type="dxa"/>
+        </w:trPr>
+        <w:tc>
+          <w:tcPr>
+            <w:tcW w:w="0" w:type="auto"/>
+            <w:tcBorders>
+              <w:top w:val="single" w:sz="6" w:space="0" w:color="C4C7C5"/>
+              <w:left w:val="single" w:sz="6" w:space="0" w:color="C4C7C5"/>
+              <w:bottom w:val="single" w:sz="6" w:space="0" w:color="C4C7C5"/>
+              <w:right w:val="single" w:sz="6" w:space="0" w:color="C4C7C5"/>
+            </w:tcBorders>
+            <w:tcMar>
+              <w:top w:w="120" w:type="dxa"/>
+              <w:left w:w="180" w:type="dxa"/>
+              <w:bottom w:w="120" w:type="dxa"/>
+              <w:right w:w="180" w:type="dxa"/>
+            </w:tcMar>
+            <w:vAlign w:val="center"/>
+            <w:hideMark/>
+          </w:tcPr>
+          <w:p>
+            <w:r>
+              <w:rPr>
+                <w:b/>
+                <w:bCs/>
+              </w:rPr>
+              <w:t>POST</w:t>
+            </w:r>
+          </w:p>
+        </w:tc>
+        <w:tc>
+          <w:tcPr>
+            <w:tcW w:w="0" w:type="auto"/>
+            <w:tcBorders>
+              <w:top w:val="single" w:sz="6" w:space="0" w:color="C4C7C5"/>
+              <w:left w:val="single" w:sz="6" w:space="0" w:color="C4C7C5"/>
+              <w:bottom w:val="single" w:sz="6" w:space="0" w:color="C4C7C5"/>
+              <w:right w:val="single" w:sz="6" w:space="0" w:color="C4C7C5"/>
+            </w:tcBorders>
+            <w:tcMar>
+              <w:top w:w="120" w:type="dxa"/>
+              <w:left w:w="180" w:type="dxa"/>
+              <w:bottom w:w="120" w:type="dxa"/>
+              <w:right w:w="180" w:type="dxa"/>
+            </w:tcMar>
+            <w:vAlign w:val="center"/>
+            <w:hideMark/>
+          </w:tcPr>
+          <w:p>
+            <w:r>
+              <w:t>/</w:t>
+            </w:r>
+            <w:proofErr w:type="spellStart"/>
+            <w:r>
+              <w:t>api</w:t>
+            </w:r>
+            <w:proofErr w:type="spellEnd"/>
+            <w:r>
+              <w:t>/events</w:t>
+            </w:r>
+          </w:p>
+        </w:tc>
+        <w:tc>
+          <w:tcPr>
+            <w:tcW w:w="0" w:type="auto"/>
+            <w:tcBorders>
+              <w:top w:val="single" w:sz="6" w:space="0" w:color="C4C7C5"/>
+              <w:left w:val="single" w:sz="6" w:space="0" w:color="C4C7C5"/>
+              <w:bottom w:val="single" w:sz="6" w:space="0" w:color="C4C7C5"/>
+              <w:right w:val="single" w:sz="6" w:space="0" w:color="C4C7C5"/>
+            </w:tcBorders>
+            <w:tcMar>
+              <w:top w:w="120" w:type="dxa"/>
+              <w:left w:w="180" w:type="dxa"/>
+              <w:bottom w:w="120" w:type="dxa"/>
+              <w:right w:w="180" w:type="dxa"/>
+            </w:tcMar>
+            <w:vAlign w:val="center"/>
+            <w:hideMark/>
+          </w:tcPr>
+          <w:p>
+            <w:r>
+              <w:t>Creates a new event managed by the authenticated organiser.</w:t>
+            </w:r>
+          </w:p>
+        </w:tc>
+        <w:tc>
+          <w:tcPr>
+            <w:tcW w:w="0" w:type="auto"/>
+            <w:tcBorders>
+              <w:top w:val="single" w:sz="6" w:space="0" w:color="C4C7C5"/>
+              <w:left w:val="single" w:sz="6" w:space="0" w:color="C4C7C5"/>
+              <w:bottom w:val="single" w:sz="6" w:space="0" w:color="C4C7C5"/>
+              <w:right w:val="single" w:sz="6" w:space="0" w:color="C4C7C5"/>
+            </w:tcBorders>
+            <w:tcMar>
+              <w:top w:w="120" w:type="dxa"/>
+              <w:left w:w="180" w:type="dxa"/>
+              <w:bottom w:w="120" w:type="dxa"/>
+              <w:right w:w="180" w:type="dxa"/>
+            </w:tcMar>
+            <w:vAlign w:val="center"/>
+            <w:hideMark/>
+          </w:tcPr>
+          <w:p>
+            <w:r>
+              <w:t>Organiser</w:t>
+            </w:r>
+          </w:p>
+        </w:tc>
+        <w:tc>
+          <w:tcPr>
+            <w:tcW w:w="0" w:type="auto"/>
+            <w:tcBorders>
+              <w:top w:val="single" w:sz="6" w:space="0" w:color="C4C7C5"/>
+              <w:left w:val="single" w:sz="6" w:space="0" w:color="C4C7C5"/>
+              <w:bottom w:val="single" w:sz="6" w:space="0" w:color="C4C7C5"/>
+              <w:right w:val="single" w:sz="6" w:space="0" w:color="C4C7C5"/>
+            </w:tcBorders>
+            <w:tcMar>
+              <w:top w:w="120" w:type="dxa"/>
+              <w:left w:w="180" w:type="dxa"/>
+              <w:bottom w:w="120" w:type="dxa"/>
+              <w:right w:w="180" w:type="dxa"/>
+            </w:tcMar>
+            <w:vAlign w:val="center"/>
+            <w:hideMark/>
+          </w:tcPr>
+          <w:p>
+            <w:proofErr w:type="gramStart"/>
+            <w:r>
+              <w:t>{ name</w:t>
+            </w:r>
+            <w:proofErr w:type="gramEnd"/>
+            <w:r>
+              <w:t xml:space="preserve">, description, date, location, distance, </w:t>
+            </w:r>
+            <w:proofErr w:type="spellStart"/>
+            <w:proofErr w:type="gramStart"/>
+            <w:r>
+              <w:t>eventType</w:t>
+            </w:r>
+            <w:proofErr w:type="spellEnd"/>
+            <w:r>
+              <w:t xml:space="preserve"> }</w:t>
+            </w:r>
+            <w:proofErr w:type="gramEnd"/>
+          </w:p>
+        </w:tc>
+        <w:tc>
+          <w:tcPr>
+            <w:tcW w:w="0" w:type="auto"/>
+            <w:tcBorders>
+              <w:top w:val="single" w:sz="6" w:space="0" w:color="C4C7C5"/>
+              <w:left w:val="single" w:sz="6" w:space="0" w:color="C4C7C5"/>
+              <w:bottom w:val="single" w:sz="6" w:space="0" w:color="C4C7C5"/>
+              <w:right w:val="single" w:sz="6" w:space="0" w:color="C4C7C5"/>
+            </w:tcBorders>
+            <w:tcMar>
+              <w:top w:w="120" w:type="dxa"/>
+              <w:left w:w="180" w:type="dxa"/>
+              <w:bottom w:w="120" w:type="dxa"/>
+              <w:right w:w="180" w:type="dxa"/>
+            </w:tcMar>
+            <w:vAlign w:val="center"/>
+            <w:hideMark/>
+          </w:tcPr>
+          <w:p>
+            <w:r>
+              <w:t>201 Created - Event created.</w:t>
+            </w:r>
+          </w:p>
+          <w:p>
+            <w:r>
+              <w:br/>
+            </w:r>
+          </w:p>
+          <w:p>
+            <w:r>
+              <w:t>403 Forbidden - Not an organiser.</w:t>
+            </w:r>
+          </w:p>
+        </w:tc>
+      </w:tr>
+      <w:tr>
+        <w:trPr>
+          <w:tblCellSpacing w:w="15" w:type="dxa"/>
+        </w:trPr>
+        <w:tc>
+          <w:tcPr>
+            <w:tcW w:w="0" w:type="auto"/>
+            <w:tcBorders>
+              <w:top w:val="single" w:sz="6" w:space="0" w:color="C4C7C5"/>
+              <w:left w:val="single" w:sz="6" w:space="0" w:color="C4C7C5"/>
+              <w:bottom w:val="single" w:sz="6" w:space="0" w:color="C4C7C5"/>
+              <w:right w:val="single" w:sz="6" w:space="0" w:color="C4C7C5"/>
+            </w:tcBorders>
+            <w:tcMar>
+              <w:top w:w="120" w:type="dxa"/>
+              <w:left w:w="180" w:type="dxa"/>
+              <w:bottom w:w="120" w:type="dxa"/>
+              <w:right w:w="180" w:type="dxa"/>
+            </w:tcMar>
+            <w:vAlign w:val="center"/>
+            <w:hideMark/>
+          </w:tcPr>
+          <w:p>
+            <w:r>
+              <w:rPr>
+                <w:b/>
+                <w:bCs/>
+              </w:rPr>
+              <w:t>PUT</w:t>
+            </w:r>
+          </w:p>
+        </w:tc>
+        <w:tc>
+          <w:tcPr>
+            <w:tcW w:w="0" w:type="auto"/>
+            <w:tcBorders>
+              <w:top w:val="single" w:sz="6" w:space="0" w:color="C4C7C5"/>
+              <w:left w:val="single" w:sz="6" w:space="0" w:color="C4C7C5"/>
+              <w:bottom w:val="single" w:sz="6" w:space="0" w:color="C4C7C5"/>
+              <w:right w:val="single" w:sz="6" w:space="0" w:color="C4C7C5"/>
+            </w:tcBorders>
+            <w:tcMar>
+              <w:top w:w="120" w:type="dxa"/>
+              <w:left w:w="180" w:type="dxa"/>
+              <w:bottom w:w="120" w:type="dxa"/>
+              <w:right w:w="180" w:type="dxa"/>
+            </w:tcMar>
+            <w:vAlign w:val="center"/>
+            <w:hideMark/>
+          </w:tcPr>
+          <w:p>
+            <w:r>
+              <w:t>/</w:t>
+            </w:r>
+            <w:proofErr w:type="spellStart"/>
+            <w:proofErr w:type="gramStart"/>
+            <w:r>
+              <w:t>api</w:t>
+            </w:r>
+            <w:proofErr w:type="spellEnd"/>
+            <w:proofErr w:type="gramEnd"/>
+            <w:r>
+              <w:t>/events/{id}</w:t>
+            </w:r>
+          </w:p>
+        </w:tc>
+        <w:tc>
+          <w:tcPr>
+            <w:tcW w:w="0" w:type="auto"/>
+            <w:tcBorders>
+              <w:top w:val="single" w:sz="6" w:space="0" w:color="C4C7C5"/>
+              <w:left w:val="single" w:sz="6" w:space="0" w:color="C4C7C5"/>
+              <w:bottom w:val="single" w:sz="6" w:space="0" w:color="C4C7C5"/>
+              <w:right w:val="single" w:sz="6" w:space="0" w:color="C4C7C5"/>
+            </w:tcBorders>
+            <w:tcMar>
+              <w:top w:w="120" w:type="dxa"/>
+              <w:left w:w="180" w:type="dxa"/>
+              <w:bottom w:w="120" w:type="dxa"/>
+              <w:right w:w="180" w:type="dxa"/>
+            </w:tcMar>
+            <w:vAlign w:val="center"/>
+            <w:hideMark/>
+          </w:tcPr>
+          <w:p>
+            <w:r>
+              <w:t>Updates existing event details.</w:t>
+            </w:r>
+          </w:p>
+        </w:tc>
+        <w:tc>
+          <w:tcPr>
+            <w:tcW w:w="0" w:type="auto"/>
+            <w:tcBorders>
+              <w:top w:val="single" w:sz="6" w:space="0" w:color="C4C7C5"/>
+              <w:left w:val="single" w:sz="6" w:space="0" w:color="C4C7C5"/>
+              <w:bottom w:val="single" w:sz="6" w:space="0" w:color="C4C7C5"/>
+              <w:right w:val="single" w:sz="6" w:space="0" w:color="C4C7C5"/>
+            </w:tcBorders>
+            <w:tcMar>
+              <w:top w:w="120" w:type="dxa"/>
+              <w:left w:w="180" w:type="dxa"/>
+              <w:bottom w:w="120" w:type="dxa"/>
+              <w:right w:w="180" w:type="dxa"/>
+            </w:tcMar>
+            <w:vAlign w:val="center"/>
+            <w:hideMark/>
+          </w:tcPr>
+          <w:p>
+            <w:r>
+              <w:t>Organiser</w:t>
+            </w:r>
+          </w:p>
+        </w:tc>
+        <w:tc>
+          <w:tcPr>
+            <w:tcW w:w="0" w:type="auto"/>
+            <w:tcBorders>
+              <w:top w:val="single" w:sz="6" w:space="0" w:color="C4C7C5"/>
+              <w:left w:val="single" w:sz="6" w:space="0" w:color="C4C7C5"/>
+              <w:bottom w:val="single" w:sz="6" w:space="0" w:color="C4C7C5"/>
+              <w:right w:val="single" w:sz="6" w:space="0" w:color="C4C7C5"/>
+            </w:tcBorders>
+            <w:tcMar>
+              <w:top w:w="120" w:type="dxa"/>
+              <w:left w:w="180" w:type="dxa"/>
+              <w:bottom w:w="120" w:type="dxa"/>
+              <w:right w:w="180" w:type="dxa"/>
+            </w:tcMar>
+            <w:vAlign w:val="center"/>
+            <w:hideMark/>
+          </w:tcPr>
+          <w:p>
+            <w:proofErr w:type="gramStart"/>
+            <w:r>
+              <w:t>{ name</w:t>
+            </w:r>
+            <w:proofErr w:type="gramEnd"/>
+            <w:r>
+              <w:t xml:space="preserve">, description, date, location, distance, </w:t>
+            </w:r>
+            <w:proofErr w:type="spellStart"/>
+            <w:proofErr w:type="gramStart"/>
+            <w:r>
+              <w:t>eventType</w:t>
+            </w:r>
+            <w:proofErr w:type="spellEnd"/>
+            <w:r>
+              <w:t xml:space="preserve"> }</w:t>
+            </w:r>
+            <w:proofErr w:type="gramEnd"/>
+          </w:p>
+        </w:tc>
+        <w:tc>
+          <w:tcPr>
+            <w:tcW w:w="0" w:type="auto"/>
+            <w:tcBorders>
+              <w:top w:val="single" w:sz="6" w:space="0" w:color="C4C7C5"/>
+              <w:left w:val="single" w:sz="6" w:space="0" w:color="C4C7C5"/>
+              <w:bottom w:val="single" w:sz="6" w:space="0" w:color="C4C7C5"/>
+              <w:right w:val="single" w:sz="6" w:space="0" w:color="C4C7C5"/>
+            </w:tcBorders>
+            <w:tcMar>
+              <w:top w:w="120" w:type="dxa"/>
+              <w:left w:w="180" w:type="dxa"/>
+              <w:bottom w:w="120" w:type="dxa"/>
+              <w:right w:w="180" w:type="dxa"/>
+            </w:tcMar>
+            <w:vAlign w:val="center"/>
+            <w:hideMark/>
+          </w:tcPr>
+          <w:p>
+            <w:r>
+              <w:t>200 OK - Event updated.</w:t>
+            </w:r>
+          </w:p>
+          <w:p>
+            <w:r>
+              <w:br/>
+            </w:r>
+          </w:p>
+          <w:p>
+            <w:r>
               <w:lastRenderedPageBreak/>
-              <w:t>404 Not Found - Event does not exist.</w:t>
+              <w:t>404 Not Found - Event not found.</w:t>
+            </w:r>
+          </w:p>
+        </w:tc>
+      </w:tr>
+      <w:tr>
+        <w:trPr>
+          <w:tblCellSpacing w:w="15" w:type="dxa"/>
+        </w:trPr>
+        <w:tc>
+          <w:tcPr>
+            <w:tcW w:w="0" w:type="auto"/>
+            <w:tcBorders>
+              <w:top w:val="single" w:sz="6" w:space="0" w:color="C4C7C5"/>
+              <w:left w:val="single" w:sz="6" w:space="0" w:color="C4C7C5"/>
+              <w:bottom w:val="single" w:sz="6" w:space="0" w:color="C4C7C5"/>
+              <w:right w:val="single" w:sz="6" w:space="0" w:color="C4C7C5"/>
+            </w:tcBorders>
+            <w:tcMar>
+              <w:top w:w="120" w:type="dxa"/>
+              <w:left w:w="180" w:type="dxa"/>
+              <w:bottom w:w="120" w:type="dxa"/>
+              <w:right w:w="180" w:type="dxa"/>
+            </w:tcMar>
+            <w:vAlign w:val="center"/>
+            <w:hideMark/>
+          </w:tcPr>
+          <w:p>
+            <w:r>
+              <w:rPr>
+                <w:b/>
+                <w:bCs/>
+              </w:rPr>
+              <w:lastRenderedPageBreak/>
+              <w:t>DELETE</w:t>
+            </w:r>
+          </w:p>
+        </w:tc>
+        <w:tc>
+          <w:tcPr>
+            <w:tcW w:w="0" w:type="auto"/>
+            <w:tcBorders>
+              <w:top w:val="single" w:sz="6" w:space="0" w:color="C4C7C5"/>
+              <w:left w:val="single" w:sz="6" w:space="0" w:color="C4C7C5"/>
+              <w:bottom w:val="single" w:sz="6" w:space="0" w:color="C4C7C5"/>
+              <w:right w:val="single" w:sz="6" w:space="0" w:color="C4C7C5"/>
+            </w:tcBorders>
+            <w:tcMar>
+              <w:top w:w="120" w:type="dxa"/>
+              <w:left w:w="180" w:type="dxa"/>
+              <w:bottom w:w="120" w:type="dxa"/>
+              <w:right w:w="180" w:type="dxa"/>
+            </w:tcMar>
+            <w:vAlign w:val="center"/>
+            <w:hideMark/>
+          </w:tcPr>
+          <w:p>
+            <w:r>
+              <w:t>/</w:t>
+            </w:r>
+            <w:proofErr w:type="spellStart"/>
+            <w:proofErr w:type="gramStart"/>
+            <w:r>
+              <w:t>api</w:t>
+            </w:r>
+            <w:proofErr w:type="spellEnd"/>
+            <w:proofErr w:type="gramEnd"/>
+            <w:r>
+              <w:t>/events/{id}</w:t>
+            </w:r>
+          </w:p>
+        </w:tc>
+        <w:tc>
+          <w:tcPr>
+            <w:tcW w:w="0" w:type="auto"/>
+            <w:tcBorders>
+              <w:top w:val="single" w:sz="6" w:space="0" w:color="C4C7C5"/>
+              <w:left w:val="single" w:sz="6" w:space="0" w:color="C4C7C5"/>
+              <w:bottom w:val="single" w:sz="6" w:space="0" w:color="C4C7C5"/>
+              <w:right w:val="single" w:sz="6" w:space="0" w:color="C4C7C5"/>
+            </w:tcBorders>
+            <w:tcMar>
+              <w:top w:w="120" w:type="dxa"/>
+              <w:left w:w="180" w:type="dxa"/>
+              <w:bottom w:w="120" w:type="dxa"/>
+              <w:right w:w="180" w:type="dxa"/>
+            </w:tcMar>
+            <w:vAlign w:val="center"/>
+            <w:hideMark/>
+          </w:tcPr>
+          <w:p>
+            <w:r>
+              <w:t>Removes an event and associated categories/enrolments.</w:t>
+            </w:r>
+          </w:p>
+        </w:tc>
+        <w:tc>
+          <w:tcPr>
+            <w:tcW w:w="0" w:type="auto"/>
+            <w:tcBorders>
+              <w:top w:val="single" w:sz="6" w:space="0" w:color="C4C7C5"/>
+              <w:left w:val="single" w:sz="6" w:space="0" w:color="C4C7C5"/>
+              <w:bottom w:val="single" w:sz="6" w:space="0" w:color="C4C7C5"/>
+              <w:right w:val="single" w:sz="6" w:space="0" w:color="C4C7C5"/>
+            </w:tcBorders>
+            <w:tcMar>
+              <w:top w:w="120" w:type="dxa"/>
+              <w:left w:w="180" w:type="dxa"/>
+              <w:bottom w:w="120" w:type="dxa"/>
+              <w:right w:w="180" w:type="dxa"/>
+            </w:tcMar>
+            <w:vAlign w:val="center"/>
+            <w:hideMark/>
+          </w:tcPr>
+          <w:p>
+            <w:r>
+              <w:t>Organiser</w:t>
+            </w:r>
+          </w:p>
+        </w:tc>
+        <w:tc>
+          <w:tcPr>
+            <w:tcW w:w="0" w:type="auto"/>
+            <w:tcBorders>
+              <w:top w:val="single" w:sz="6" w:space="0" w:color="C4C7C5"/>
+              <w:left w:val="single" w:sz="6" w:space="0" w:color="C4C7C5"/>
+              <w:bottom w:val="single" w:sz="6" w:space="0" w:color="C4C7C5"/>
+              <w:right w:val="single" w:sz="6" w:space="0" w:color="C4C7C5"/>
+            </w:tcBorders>
+            <w:tcMar>
+              <w:top w:w="120" w:type="dxa"/>
+              <w:left w:w="180" w:type="dxa"/>
+              <w:bottom w:w="120" w:type="dxa"/>
+              <w:right w:w="180" w:type="dxa"/>
+            </w:tcMar>
+            <w:vAlign w:val="center"/>
+            <w:hideMark/>
+          </w:tcPr>
+          <w:p>
+            <w:r>
+              <w:t>None</w:t>
+            </w:r>
+          </w:p>
+        </w:tc>
+        <w:tc>
+          <w:tcPr>
+            <w:tcW w:w="0" w:type="auto"/>
+            <w:tcBorders>
+              <w:top w:val="single" w:sz="6" w:space="0" w:color="C4C7C5"/>
+              <w:left w:val="single" w:sz="6" w:space="0" w:color="C4C7C5"/>
+              <w:bottom w:val="single" w:sz="6" w:space="0" w:color="C4C7C5"/>
+              <w:right w:val="single" w:sz="6" w:space="0" w:color="C4C7C5"/>
+            </w:tcBorders>
+            <w:tcMar>
+              <w:top w:w="120" w:type="dxa"/>
+              <w:left w:w="180" w:type="dxa"/>
+              <w:bottom w:w="120" w:type="dxa"/>
+              <w:right w:w="180" w:type="dxa"/>
+            </w:tcMar>
+            <w:vAlign w:val="center"/>
+            <w:hideMark/>
+          </w:tcPr>
+          <w:p>
+            <w:r>
+              <w:t>200 OK - Event deleted.</w:t>
+            </w:r>
+          </w:p>
+          <w:p>
+            <w:r>
+              <w:br/>
+            </w:r>
+          </w:p>
+          <w:p>
+            <w:r>
+              <w:t>404 Not Found - Event not found.</w:t>
+            </w:r>
+          </w:p>
+        </w:tc>
+      </w:tr>
+      <w:tr>
+        <w:trPr>
+          <w:tblCellSpacing w:w="15" w:type="dxa"/>
+        </w:trPr>
+        <w:tc>
+          <w:tcPr>
+            <w:tcW w:w="0" w:type="auto"/>
+            <w:tcBorders>
+              <w:top w:val="single" w:sz="6" w:space="0" w:color="C4C7C5"/>
+              <w:left w:val="single" w:sz="6" w:space="0" w:color="C4C7C5"/>
+              <w:bottom w:val="single" w:sz="6" w:space="0" w:color="C4C7C5"/>
+              <w:right w:val="single" w:sz="6" w:space="0" w:color="C4C7C5"/>
+            </w:tcBorders>
+            <w:tcMar>
+              <w:top w:w="120" w:type="dxa"/>
+              <w:left w:w="180" w:type="dxa"/>
+              <w:bottom w:w="120" w:type="dxa"/>
+              <w:right w:w="180" w:type="dxa"/>
+            </w:tcMar>
+            <w:vAlign w:val="center"/>
+            <w:hideMark/>
+          </w:tcPr>
+          <w:p>
+            <w:r>
+              <w:rPr>
+                <w:b/>
+                <w:bCs/>
+              </w:rPr>
+              <w:t>GET</w:t>
+            </w:r>
+          </w:p>
+        </w:tc>
+        <w:tc>
+          <w:tcPr>
+            <w:tcW w:w="0" w:type="auto"/>
+            <w:tcBorders>
+              <w:top w:val="single" w:sz="6" w:space="0" w:color="C4C7C5"/>
+              <w:left w:val="single" w:sz="6" w:space="0" w:color="C4C7C5"/>
+              <w:bottom w:val="single" w:sz="6" w:space="0" w:color="C4C7C5"/>
+              <w:right w:val="single" w:sz="6" w:space="0" w:color="C4C7C5"/>
+            </w:tcBorders>
+            <w:tcMar>
+              <w:top w:w="120" w:type="dxa"/>
+              <w:left w:w="180" w:type="dxa"/>
+              <w:bottom w:w="120" w:type="dxa"/>
+              <w:right w:w="180" w:type="dxa"/>
+            </w:tcMar>
+            <w:vAlign w:val="center"/>
+            <w:hideMark/>
+          </w:tcPr>
+          <w:p>
+            <w:r>
+              <w:t>/</w:t>
+            </w:r>
+            <w:proofErr w:type="spellStart"/>
+            <w:proofErr w:type="gramStart"/>
+            <w:r>
+              <w:t>api</w:t>
+            </w:r>
+            <w:proofErr w:type="spellEnd"/>
+            <w:proofErr w:type="gramEnd"/>
+            <w:r>
+              <w:t>/events/{</w:t>
+            </w:r>
+            <w:proofErr w:type="spellStart"/>
+            <w:r>
+              <w:t>eventId</w:t>
+            </w:r>
+            <w:proofErr w:type="spellEnd"/>
+            <w:r>
+              <w:t>}/categories</w:t>
+            </w:r>
+          </w:p>
+        </w:tc>
+        <w:tc>
+          <w:tcPr>
+            <w:tcW w:w="0" w:type="auto"/>
+            <w:tcBorders>
+              <w:top w:val="single" w:sz="6" w:space="0" w:color="C4C7C5"/>
+              <w:left w:val="single" w:sz="6" w:space="0" w:color="C4C7C5"/>
+              <w:bottom w:val="single" w:sz="6" w:space="0" w:color="C4C7C5"/>
+              <w:right w:val="single" w:sz="6" w:space="0" w:color="C4C7C5"/>
+            </w:tcBorders>
+            <w:tcMar>
+              <w:top w:w="120" w:type="dxa"/>
+              <w:left w:w="180" w:type="dxa"/>
+              <w:bottom w:w="120" w:type="dxa"/>
+              <w:right w:w="180" w:type="dxa"/>
+            </w:tcMar>
+            <w:vAlign w:val="center"/>
+            <w:hideMark/>
+          </w:tcPr>
+          <w:p>
+            <w:r>
+              <w:t>Lists all categories defined for a specific event.</w:t>
+            </w:r>
+          </w:p>
+        </w:tc>
+        <w:tc>
+          <w:tcPr>
+            <w:tcW w:w="0" w:type="auto"/>
+            <w:tcBorders>
+              <w:top w:val="single" w:sz="6" w:space="0" w:color="C4C7C5"/>
+              <w:left w:val="single" w:sz="6" w:space="0" w:color="C4C7C5"/>
+              <w:bottom w:val="single" w:sz="6" w:space="0" w:color="C4C7C5"/>
+              <w:right w:val="single" w:sz="6" w:space="0" w:color="C4C7C5"/>
+            </w:tcBorders>
+            <w:tcMar>
+              <w:top w:w="120" w:type="dxa"/>
+              <w:left w:w="180" w:type="dxa"/>
+              <w:bottom w:w="120" w:type="dxa"/>
+              <w:right w:w="180" w:type="dxa"/>
+            </w:tcMar>
+            <w:vAlign w:val="center"/>
+            <w:hideMark/>
+          </w:tcPr>
+          <w:p>
+            <w:r>
+              <w:t>None</w:t>
+            </w:r>
+          </w:p>
+        </w:tc>
+        <w:tc>
+          <w:tcPr>
+            <w:tcW w:w="0" w:type="auto"/>
+            <w:tcBorders>
+              <w:top w:val="single" w:sz="6" w:space="0" w:color="C4C7C5"/>
+              <w:left w:val="single" w:sz="6" w:space="0" w:color="C4C7C5"/>
+              <w:bottom w:val="single" w:sz="6" w:space="0" w:color="C4C7C5"/>
+              <w:right w:val="single" w:sz="6" w:space="0" w:color="C4C7C5"/>
+            </w:tcBorders>
+            <w:tcMar>
+              <w:top w:w="120" w:type="dxa"/>
+              <w:left w:w="180" w:type="dxa"/>
+              <w:bottom w:w="120" w:type="dxa"/>
+              <w:right w:w="180" w:type="dxa"/>
+            </w:tcMar>
+            <w:vAlign w:val="center"/>
+            <w:hideMark/>
+          </w:tcPr>
+          <w:p>
+            <w:r>
+              <w:t>None</w:t>
+            </w:r>
+          </w:p>
+        </w:tc>
+        <w:tc>
+          <w:tcPr>
+            <w:tcW w:w="0" w:type="auto"/>
+            <w:tcBorders>
+              <w:top w:val="single" w:sz="6" w:space="0" w:color="C4C7C5"/>
+              <w:left w:val="single" w:sz="6" w:space="0" w:color="C4C7C5"/>
+              <w:bottom w:val="single" w:sz="6" w:space="0" w:color="C4C7C5"/>
+              <w:right w:val="single" w:sz="6" w:space="0" w:color="C4C7C5"/>
+            </w:tcBorders>
+            <w:tcMar>
+              <w:top w:w="120" w:type="dxa"/>
+              <w:left w:w="180" w:type="dxa"/>
+              <w:bottom w:w="120" w:type="dxa"/>
+              <w:right w:w="180" w:type="dxa"/>
+            </w:tcMar>
+            <w:vAlign w:val="center"/>
+            <w:hideMark/>
+          </w:tcPr>
+          <w:p>
+            <w:r>
+              <w:t>200 OK - Array of categories.</w:t>
+            </w:r>
+          </w:p>
+          <w:p>
+            <w:r>
+              <w:br/>
+            </w:r>
+          </w:p>
+          <w:p>
+            <w:r>
+              <w:t>404 Not Found - Event not found.</w:t>
+            </w:r>
+          </w:p>
+        </w:tc>
+      </w:tr>
+      <w:tr>
+        <w:trPr>
+          <w:tblCellSpacing w:w="15" w:type="dxa"/>
+        </w:trPr>
+        <w:tc>
+          <w:tcPr>
+            <w:tcW w:w="0" w:type="auto"/>
+            <w:tcBorders>
+              <w:top w:val="single" w:sz="6" w:space="0" w:color="C4C7C5"/>
+              <w:left w:val="single" w:sz="6" w:space="0" w:color="C4C7C5"/>
+              <w:bottom w:val="single" w:sz="6" w:space="0" w:color="C4C7C5"/>
+              <w:right w:val="single" w:sz="6" w:space="0" w:color="C4C7C5"/>
+            </w:tcBorders>
+            <w:tcMar>
+              <w:top w:w="120" w:type="dxa"/>
+              <w:left w:w="180" w:type="dxa"/>
+              <w:bottom w:w="120" w:type="dxa"/>
+              <w:right w:w="180" w:type="dxa"/>
+            </w:tcMar>
+            <w:vAlign w:val="center"/>
+            <w:hideMark/>
+          </w:tcPr>
+          <w:p>
+            <w:r>
+              <w:rPr>
+                <w:b/>
+                <w:bCs/>
+              </w:rPr>
+              <w:t>POST</w:t>
+            </w:r>
+          </w:p>
+        </w:tc>
+        <w:tc>
+          <w:tcPr>
+            <w:tcW w:w="0" w:type="auto"/>
+            <w:tcBorders>
+              <w:top w:val="single" w:sz="6" w:space="0" w:color="C4C7C5"/>
+              <w:left w:val="single" w:sz="6" w:space="0" w:color="C4C7C5"/>
+              <w:bottom w:val="single" w:sz="6" w:space="0" w:color="C4C7C5"/>
+              <w:right w:val="single" w:sz="6" w:space="0" w:color="C4C7C5"/>
+            </w:tcBorders>
+            <w:tcMar>
+              <w:top w:w="120" w:type="dxa"/>
+              <w:left w:w="180" w:type="dxa"/>
+              <w:bottom w:w="120" w:type="dxa"/>
+              <w:right w:w="180" w:type="dxa"/>
+            </w:tcMar>
+            <w:vAlign w:val="center"/>
+            <w:hideMark/>
+          </w:tcPr>
+          <w:p>
+            <w:r>
+              <w:t>/</w:t>
+            </w:r>
+            <w:proofErr w:type="spellStart"/>
+            <w:proofErr w:type="gramStart"/>
+            <w:r>
+              <w:t>api</w:t>
+            </w:r>
+            <w:proofErr w:type="spellEnd"/>
+            <w:proofErr w:type="gramEnd"/>
+            <w:r>
+              <w:t>/events/{</w:t>
+            </w:r>
+            <w:proofErr w:type="spellStart"/>
+            <w:r>
+              <w:t>eventId</w:t>
+            </w:r>
+            <w:proofErr w:type="spellEnd"/>
+            <w:r>
+              <w:t>}/categories</w:t>
+            </w:r>
+          </w:p>
+        </w:tc>
+        <w:tc>
+          <w:tcPr>
+            <w:tcW w:w="0" w:type="auto"/>
+            <w:tcBorders>
+              <w:top w:val="single" w:sz="6" w:space="0" w:color="C4C7C5"/>
+              <w:left w:val="single" w:sz="6" w:space="0" w:color="C4C7C5"/>
+              <w:bottom w:val="single" w:sz="6" w:space="0" w:color="C4C7C5"/>
+              <w:right w:val="single" w:sz="6" w:space="0" w:color="C4C7C5"/>
+            </w:tcBorders>
+            <w:tcMar>
+              <w:top w:w="120" w:type="dxa"/>
+              <w:left w:w="180" w:type="dxa"/>
+              <w:bottom w:w="120" w:type="dxa"/>
+              <w:right w:w="180" w:type="dxa"/>
+            </w:tcMar>
+            <w:vAlign w:val="center"/>
+            <w:hideMark/>
+          </w:tcPr>
+          <w:p>
+            <w:r>
+              <w:t>Adds a new age/distance category to an existing event.</w:t>
+            </w:r>
+          </w:p>
+        </w:tc>
+        <w:tc>
+          <w:tcPr>
+            <w:tcW w:w="0" w:type="auto"/>
+            <w:tcBorders>
+              <w:top w:val="single" w:sz="6" w:space="0" w:color="C4C7C5"/>
+              <w:left w:val="single" w:sz="6" w:space="0" w:color="C4C7C5"/>
+              <w:bottom w:val="single" w:sz="6" w:space="0" w:color="C4C7C5"/>
+              <w:right w:val="single" w:sz="6" w:space="0" w:color="C4C7C5"/>
+            </w:tcBorders>
+            <w:tcMar>
+              <w:top w:w="120" w:type="dxa"/>
+              <w:left w:w="180" w:type="dxa"/>
+              <w:bottom w:w="120" w:type="dxa"/>
+              <w:right w:w="180" w:type="dxa"/>
+            </w:tcMar>
+            <w:vAlign w:val="center"/>
+            <w:hideMark/>
+          </w:tcPr>
+          <w:p>
+            <w:r>
+              <w:t>Organiser</w:t>
+            </w:r>
+          </w:p>
+        </w:tc>
+        <w:tc>
+          <w:tcPr>
+            <w:tcW w:w="0" w:type="auto"/>
+            <w:tcBorders>
+              <w:top w:val="single" w:sz="6" w:space="0" w:color="C4C7C5"/>
+              <w:left w:val="single" w:sz="6" w:space="0" w:color="C4C7C5"/>
+              <w:bottom w:val="single" w:sz="6" w:space="0" w:color="C4C7C5"/>
+              <w:right w:val="single" w:sz="6" w:space="0" w:color="C4C7C5"/>
+            </w:tcBorders>
+            <w:tcMar>
+              <w:top w:w="120" w:type="dxa"/>
+              <w:left w:w="180" w:type="dxa"/>
+              <w:bottom w:w="120" w:type="dxa"/>
+              <w:right w:w="180" w:type="dxa"/>
+            </w:tcMar>
+            <w:vAlign w:val="center"/>
+            <w:hideMark/>
+          </w:tcPr>
+          <w:p>
+            <w:proofErr w:type="gramStart"/>
+            <w:r>
+              <w:t xml:space="preserve">{ </w:t>
+            </w:r>
+            <w:proofErr w:type="spellStart"/>
+            <w:r>
+              <w:t>categoryName</w:t>
+            </w:r>
+            <w:proofErr w:type="spellEnd"/>
+            <w:proofErr w:type="gramEnd"/>
+            <w:r>
+              <w:t xml:space="preserve">, </w:t>
+            </w:r>
+            <w:proofErr w:type="spellStart"/>
+            <w:r>
+              <w:t>minAge</w:t>
+            </w:r>
+            <w:proofErr w:type="spellEnd"/>
+            <w:r>
+              <w:t xml:space="preserve">, </w:t>
+            </w:r>
+            <w:proofErr w:type="spellStart"/>
+            <w:proofErr w:type="gramStart"/>
+            <w:r>
+              <w:t>maxAge</w:t>
+            </w:r>
+            <w:proofErr w:type="spellEnd"/>
+            <w:r>
+              <w:t xml:space="preserve"> }</w:t>
+            </w:r>
+            <w:proofErr w:type="gramEnd"/>
+          </w:p>
+        </w:tc>
+        <w:tc>
+          <w:tcPr>
+            <w:tcW w:w="0" w:type="auto"/>
+            <w:tcBorders>
+              <w:top w:val="single" w:sz="6" w:space="0" w:color="C4C7C5"/>
+              <w:left w:val="single" w:sz="6" w:space="0" w:color="C4C7C5"/>
+              <w:bottom w:val="single" w:sz="6" w:space="0" w:color="C4C7C5"/>
+              <w:right w:val="single" w:sz="6" w:space="0" w:color="C4C7C5"/>
+            </w:tcBorders>
+            <w:tcMar>
+              <w:top w:w="120" w:type="dxa"/>
+              <w:left w:w="180" w:type="dxa"/>
+              <w:bottom w:w="120" w:type="dxa"/>
+              <w:right w:w="180" w:type="dxa"/>
+            </w:tcMar>
+            <w:vAlign w:val="center"/>
+            <w:hideMark/>
+          </w:tcPr>
+          <w:p>
+            <w:r>
+              <w:t>201 Created - Category added.</w:t>
+            </w:r>
+          </w:p>
+          <w:p>
+            <w:r>
+              <w:lastRenderedPageBreak/>
+              <w:br/>
+            </w:r>
+          </w:p>
+          <w:p>
+            <w:r>
+              <w:t>400 Bad Request - Invalid age ranges.</w:t>
             </w:r>
           </w:p>
         </w:tc>
@@ -1461,55 +2281,55 @@
             </w:r>
             <w:proofErr w:type="spellEnd"/>
             <w:r>
-              <w:t>/events</w:t>
-            </w:r>
-          </w:p>
-        </w:tc>
-        <w:tc>
-          <w:tcPr>
-            <w:tcW w:w="0" w:type="auto"/>
-            <w:tcBorders>
-              <w:top w:val="single" w:sz="6" w:space="0" w:color="C4C7C5"/>
-              <w:left w:val="single" w:sz="6" w:space="0" w:color="C4C7C5"/>
-              <w:bottom w:val="single" w:sz="6" w:space="0" w:color="C4C7C5"/>
-              <w:right w:val="single" w:sz="6" w:space="0" w:color="C4C7C5"/>
-            </w:tcBorders>
-            <w:tcMar>
-              <w:top w:w="120" w:type="dxa"/>
-              <w:left w:w="180" w:type="dxa"/>
-              <w:bottom w:w="120" w:type="dxa"/>
-              <w:right w:w="180" w:type="dxa"/>
-            </w:tcMar>
-            <w:vAlign w:val="center"/>
-            <w:hideMark/>
-          </w:tcPr>
-          <w:p>
-            <w:r>
-              <w:t>Creates a new event managed by the authenticated organiser.</w:t>
-            </w:r>
-          </w:p>
-        </w:tc>
-        <w:tc>
-          <w:tcPr>
-            <w:tcW w:w="0" w:type="auto"/>
-            <w:tcBorders>
-              <w:top w:val="single" w:sz="6" w:space="0" w:color="C4C7C5"/>
-              <w:left w:val="single" w:sz="6" w:space="0" w:color="C4C7C5"/>
-              <w:bottom w:val="single" w:sz="6" w:space="0" w:color="C4C7C5"/>
-              <w:right w:val="single" w:sz="6" w:space="0" w:color="C4C7C5"/>
-            </w:tcBorders>
-            <w:tcMar>
-              <w:top w:w="120" w:type="dxa"/>
-              <w:left w:w="180" w:type="dxa"/>
-              <w:bottom w:w="120" w:type="dxa"/>
-              <w:right w:w="180" w:type="dxa"/>
-            </w:tcMar>
-            <w:vAlign w:val="center"/>
-            <w:hideMark/>
-          </w:tcPr>
-          <w:p>
-            <w:r>
-              <w:t>Organiser</w:t>
+              <w:t>/enrolments</w:t>
+            </w:r>
+          </w:p>
+        </w:tc>
+        <w:tc>
+          <w:tcPr>
+            <w:tcW w:w="0" w:type="auto"/>
+            <w:tcBorders>
+              <w:top w:val="single" w:sz="6" w:space="0" w:color="C4C7C5"/>
+              <w:left w:val="single" w:sz="6" w:space="0" w:color="C4C7C5"/>
+              <w:bottom w:val="single" w:sz="6" w:space="0" w:color="C4C7C5"/>
+              <w:right w:val="single" w:sz="6" w:space="0" w:color="C4C7C5"/>
+            </w:tcBorders>
+            <w:tcMar>
+              <w:top w:w="120" w:type="dxa"/>
+              <w:left w:w="180" w:type="dxa"/>
+              <w:bottom w:w="120" w:type="dxa"/>
+              <w:right w:w="180" w:type="dxa"/>
+            </w:tcMar>
+            <w:vAlign w:val="center"/>
+            <w:hideMark/>
+          </w:tcPr>
+          <w:p>
+            <w:r>
+              <w:t>Enrols the logged-in participant into an event category.</w:t>
+            </w:r>
+          </w:p>
+        </w:tc>
+        <w:tc>
+          <w:tcPr>
+            <w:tcW w:w="0" w:type="auto"/>
+            <w:tcBorders>
+              <w:top w:val="single" w:sz="6" w:space="0" w:color="C4C7C5"/>
+              <w:left w:val="single" w:sz="6" w:space="0" w:color="C4C7C5"/>
+              <w:bottom w:val="single" w:sz="6" w:space="0" w:color="C4C7C5"/>
+              <w:right w:val="single" w:sz="6" w:space="0" w:color="C4C7C5"/>
+            </w:tcBorders>
+            <w:tcMar>
+              <w:top w:w="120" w:type="dxa"/>
+              <w:left w:w="180" w:type="dxa"/>
+              <w:bottom w:w="120" w:type="dxa"/>
+              <w:right w:w="180" w:type="dxa"/>
+            </w:tcMar>
+            <w:vAlign w:val="center"/>
+            <w:hideMark/>
+          </w:tcPr>
+          <w:p>
+            <w:r>
+              <w:t>Participant</w:t>
             </w:r>
           </w:p>
         </w:tc>
@@ -1534,45 +2354,40 @@
           <w:p>
             <w:proofErr w:type="gramStart"/>
             <w:r>
-              <w:t>{ name</w:t>
-            </w:r>
+              <w:t xml:space="preserve">{ </w:t>
+            </w:r>
+            <w:proofErr w:type="spellStart"/>
+            <w:r>
+              <w:t>categoryId</w:t>
+            </w:r>
+            <w:proofErr w:type="spellEnd"/>
             <w:proofErr w:type="gramEnd"/>
             <w:r>
-              <w:t xml:space="preserve">, description, date, location, distance, </w:t>
-            </w:r>
-            <w:proofErr w:type="spellStart"/>
-            <w:proofErr w:type="gramStart"/>
-            <w:r>
-              <w:t>eventType</w:t>
-            </w:r>
-            <w:proofErr w:type="spellEnd"/>
-            <w:r>
               <w:t xml:space="preserve"> }</w:t>
             </w:r>
-            <w:proofErr w:type="gramEnd"/>
-          </w:p>
-        </w:tc>
-        <w:tc>
-          <w:tcPr>
-            <w:tcW w:w="0" w:type="auto"/>
-            <w:tcBorders>
-              <w:top w:val="single" w:sz="6" w:space="0" w:color="C4C7C5"/>
-              <w:left w:val="single" w:sz="6" w:space="0" w:color="C4C7C5"/>
-              <w:bottom w:val="single" w:sz="6" w:space="0" w:color="C4C7C5"/>
-              <w:right w:val="single" w:sz="6" w:space="0" w:color="C4C7C5"/>
-            </w:tcBorders>
-            <w:tcMar>
-              <w:top w:w="120" w:type="dxa"/>
-              <w:left w:w="180" w:type="dxa"/>
-              <w:bottom w:w="120" w:type="dxa"/>
-              <w:right w:w="180" w:type="dxa"/>
-            </w:tcMar>
-            <w:vAlign w:val="center"/>
-            <w:hideMark/>
-          </w:tcPr>
-          <w:p>
-            <w:r>
-              <w:t>201 Created - Event created.</w:t>
+          </w:p>
+        </w:tc>
+        <w:tc>
+          <w:tcPr>
+            <w:tcW w:w="0" w:type="auto"/>
+            <w:tcBorders>
+              <w:top w:val="single" w:sz="6" w:space="0" w:color="C4C7C5"/>
+              <w:left w:val="single" w:sz="6" w:space="0" w:color="C4C7C5"/>
+              <w:bottom w:val="single" w:sz="6" w:space="0" w:color="C4C7C5"/>
+              <w:right w:val="single" w:sz="6" w:space="0" w:color="C4C7C5"/>
+            </w:tcBorders>
+            <w:tcMar>
+              <w:top w:w="120" w:type="dxa"/>
+              <w:left w:w="180" w:type="dxa"/>
+              <w:bottom w:w="120" w:type="dxa"/>
+              <w:right w:w="180" w:type="dxa"/>
+            </w:tcMar>
+            <w:vAlign w:val="center"/>
+            <w:hideMark/>
+          </w:tcPr>
+          <w:p>
+            <w:r>
+              <w:t>201 Created - Enrolment completed.</w:t>
             </w:r>
           </w:p>
           <w:p>
@@ -1582,7 +2397,7 @@
           </w:p>
           <w:p>
             <w:r>
-              <w:t>403 Forbidden - Not an organiser.</w:t>
+              <w:t>409 Conflict - Participant already enrolled.</w:t>
             </w:r>
           </w:p>
         </w:tc>
@@ -1615,7 +2430,7 @@
                 <w:b/>
                 <w:bCs/>
               </w:rPr>
-              <w:t>PUT</w:t>
+              <w:t>GET</w:t>
             </w:r>
           </w:p>
         </w:tc>
@@ -1649,31 +2464,39 @@
             <w:proofErr w:type="spellEnd"/>
             <w:proofErr w:type="gramEnd"/>
             <w:r>
-              <w:t>/events/{id}</w:t>
-            </w:r>
-          </w:p>
-        </w:tc>
-        <w:tc>
-          <w:tcPr>
-            <w:tcW w:w="0" w:type="auto"/>
-            <w:tcBorders>
-              <w:top w:val="single" w:sz="6" w:space="0" w:color="C4C7C5"/>
-              <w:left w:val="single" w:sz="6" w:space="0" w:color="C4C7C5"/>
-              <w:bottom w:val="single" w:sz="6" w:space="0" w:color="C4C7C5"/>
-              <w:right w:val="single" w:sz="6" w:space="0" w:color="C4C7C5"/>
-            </w:tcBorders>
-            <w:tcMar>
-              <w:top w:w="120" w:type="dxa"/>
-              <w:left w:w="180" w:type="dxa"/>
-              <w:bottom w:w="120" w:type="dxa"/>
-              <w:right w:w="180" w:type="dxa"/>
-            </w:tcMar>
-            <w:vAlign w:val="center"/>
-            <w:hideMark/>
-          </w:tcPr>
-          <w:p>
-            <w:r>
-              <w:t>Updates existing event details.</w:t>
+              <w:t>/events/{</w:t>
+            </w:r>
+            <w:proofErr w:type="spellStart"/>
+            <w:r>
+              <w:t>eventId</w:t>
+            </w:r>
+            <w:proofErr w:type="spellEnd"/>
+            <w:r>
+              <w:t>}/enrolments</w:t>
+            </w:r>
+          </w:p>
+        </w:tc>
+        <w:tc>
+          <w:tcPr>
+            <w:tcW w:w="0" w:type="auto"/>
+            <w:tcBorders>
+              <w:top w:val="single" w:sz="6" w:space="0" w:color="C4C7C5"/>
+              <w:left w:val="single" w:sz="6" w:space="0" w:color="C4C7C5"/>
+              <w:bottom w:val="single" w:sz="6" w:space="0" w:color="C4C7C5"/>
+              <w:right w:val="single" w:sz="6" w:space="0" w:color="C4C7C5"/>
+            </w:tcBorders>
+            <w:tcMar>
+              <w:top w:w="120" w:type="dxa"/>
+              <w:left w:w="180" w:type="dxa"/>
+              <w:bottom w:w="120" w:type="dxa"/>
+              <w:right w:w="180" w:type="dxa"/>
+            </w:tcMar>
+            <w:vAlign w:val="center"/>
+            <w:hideMark/>
+          </w:tcPr>
+          <w:p>
+            <w:r>
+              <w:t>Fetches all participant enrolments for a given event.</w:t>
             </w:r>
           </w:p>
         </w:tc>
@@ -1720,47 +2543,32 @@
             <w:hideMark/>
           </w:tcPr>
           <w:p>
-            <w:proofErr w:type="gramStart"/>
-            <w:r>
-              <w:t>{ name</w:t>
-            </w:r>
-            <w:proofErr w:type="gramEnd"/>
-            <w:r>
-              <w:t xml:space="preserve">, description, date, location, distance, </w:t>
-            </w:r>
-            <w:proofErr w:type="spellStart"/>
-            <w:proofErr w:type="gramStart"/>
-            <w:r>
-              <w:t>eventType</w:t>
-            </w:r>
-            <w:proofErr w:type="spellEnd"/>
-            <w:r>
-              <w:t xml:space="preserve"> }</w:t>
-            </w:r>
-            <w:proofErr w:type="gramEnd"/>
-          </w:p>
-        </w:tc>
-        <w:tc>
-          <w:tcPr>
-            <w:tcW w:w="0" w:type="auto"/>
-            <w:tcBorders>
-              <w:top w:val="single" w:sz="6" w:space="0" w:color="C4C7C5"/>
-              <w:left w:val="single" w:sz="6" w:space="0" w:color="C4C7C5"/>
-              <w:bottom w:val="single" w:sz="6" w:space="0" w:color="C4C7C5"/>
-              <w:right w:val="single" w:sz="6" w:space="0" w:color="C4C7C5"/>
-            </w:tcBorders>
-            <w:tcMar>
-              <w:top w:w="120" w:type="dxa"/>
-              <w:left w:w="180" w:type="dxa"/>
-              <w:bottom w:w="120" w:type="dxa"/>
-              <w:right w:w="180" w:type="dxa"/>
-            </w:tcMar>
-            <w:vAlign w:val="center"/>
-            <w:hideMark/>
-          </w:tcPr>
-          <w:p>
-            <w:r>
-              <w:t>200 OK - Event updated.</w:t>
+            <w:r>
+              <w:t>None</w:t>
+            </w:r>
+          </w:p>
+        </w:tc>
+        <w:tc>
+          <w:tcPr>
+            <w:tcW w:w="0" w:type="auto"/>
+            <w:tcBorders>
+              <w:top w:val="single" w:sz="6" w:space="0" w:color="C4C7C5"/>
+              <w:left w:val="single" w:sz="6" w:space="0" w:color="C4C7C5"/>
+              <w:bottom w:val="single" w:sz="6" w:space="0" w:color="C4C7C5"/>
+              <w:right w:val="single" w:sz="6" w:space="0" w:color="C4C7C5"/>
+            </w:tcBorders>
+            <w:tcMar>
+              <w:top w:w="120" w:type="dxa"/>
+              <w:left w:w="180" w:type="dxa"/>
+              <w:bottom w:w="120" w:type="dxa"/>
+              <w:right w:w="180" w:type="dxa"/>
+            </w:tcMar>
+            <w:vAlign w:val="center"/>
+            <w:hideMark/>
+          </w:tcPr>
+          <w:p>
+            <w:r>
+              <w:t>200 OK - List of enrolled participants.</w:t>
             </w:r>
           </w:p>
           <w:p>
@@ -1770,941 +2578,7 @@
           </w:p>
           <w:p>
             <w:r>
-              <w:t>404 Not Found - Event not found.</w:t>
-            </w:r>
-          </w:p>
-        </w:tc>
-      </w:tr>
-      <w:tr>
-        <w:trPr>
-          <w:tblCellSpacing w:w="15" w:type="dxa"/>
-        </w:trPr>
-        <w:tc>
-          <w:tcPr>
-            <w:tcW w:w="0" w:type="auto"/>
-            <w:tcBorders>
-              <w:top w:val="single" w:sz="6" w:space="0" w:color="C4C7C5"/>
-              <w:left w:val="single" w:sz="6" w:space="0" w:color="C4C7C5"/>
-              <w:bottom w:val="single" w:sz="6" w:space="0" w:color="C4C7C5"/>
-              <w:right w:val="single" w:sz="6" w:space="0" w:color="C4C7C5"/>
-            </w:tcBorders>
-            <w:tcMar>
-              <w:top w:w="120" w:type="dxa"/>
-              <w:left w:w="180" w:type="dxa"/>
-              <w:bottom w:w="120" w:type="dxa"/>
-              <w:right w:w="180" w:type="dxa"/>
-            </w:tcMar>
-            <w:vAlign w:val="center"/>
-            <w:hideMark/>
-          </w:tcPr>
-          <w:p>
-            <w:r>
-              <w:rPr>
-                <w:b/>
-                <w:bCs/>
-              </w:rPr>
-              <w:t>DELETE</w:t>
-            </w:r>
-          </w:p>
-        </w:tc>
-        <w:tc>
-          <w:tcPr>
-            <w:tcW w:w="0" w:type="auto"/>
-            <w:tcBorders>
-              <w:top w:val="single" w:sz="6" w:space="0" w:color="C4C7C5"/>
-              <w:left w:val="single" w:sz="6" w:space="0" w:color="C4C7C5"/>
-              <w:bottom w:val="single" w:sz="6" w:space="0" w:color="C4C7C5"/>
-              <w:right w:val="single" w:sz="6" w:space="0" w:color="C4C7C5"/>
-            </w:tcBorders>
-            <w:tcMar>
-              <w:top w:w="120" w:type="dxa"/>
-              <w:left w:w="180" w:type="dxa"/>
-              <w:bottom w:w="120" w:type="dxa"/>
-              <w:right w:w="180" w:type="dxa"/>
-            </w:tcMar>
-            <w:vAlign w:val="center"/>
-            <w:hideMark/>
-          </w:tcPr>
-          <w:p>
-            <w:r>
-              <w:t>/</w:t>
-            </w:r>
-            <w:proofErr w:type="spellStart"/>
-            <w:proofErr w:type="gramStart"/>
-            <w:r>
-              <w:t>api</w:t>
-            </w:r>
-            <w:proofErr w:type="spellEnd"/>
-            <w:proofErr w:type="gramEnd"/>
-            <w:r>
-              <w:t>/events/{id}</w:t>
-            </w:r>
-          </w:p>
-        </w:tc>
-        <w:tc>
-          <w:tcPr>
-            <w:tcW w:w="0" w:type="auto"/>
-            <w:tcBorders>
-              <w:top w:val="single" w:sz="6" w:space="0" w:color="C4C7C5"/>
-              <w:left w:val="single" w:sz="6" w:space="0" w:color="C4C7C5"/>
-              <w:bottom w:val="single" w:sz="6" w:space="0" w:color="C4C7C5"/>
-              <w:right w:val="single" w:sz="6" w:space="0" w:color="C4C7C5"/>
-            </w:tcBorders>
-            <w:tcMar>
-              <w:top w:w="120" w:type="dxa"/>
-              <w:left w:w="180" w:type="dxa"/>
-              <w:bottom w:w="120" w:type="dxa"/>
-              <w:right w:w="180" w:type="dxa"/>
-            </w:tcMar>
-            <w:vAlign w:val="center"/>
-            <w:hideMark/>
-          </w:tcPr>
-          <w:p>
-            <w:r>
-              <w:t>Removes an event and associated categories/enrolments.</w:t>
-            </w:r>
-          </w:p>
-        </w:tc>
-        <w:tc>
-          <w:tcPr>
-            <w:tcW w:w="0" w:type="auto"/>
-            <w:tcBorders>
-              <w:top w:val="single" w:sz="6" w:space="0" w:color="C4C7C5"/>
-              <w:left w:val="single" w:sz="6" w:space="0" w:color="C4C7C5"/>
-              <w:bottom w:val="single" w:sz="6" w:space="0" w:color="C4C7C5"/>
-              <w:right w:val="single" w:sz="6" w:space="0" w:color="C4C7C5"/>
-            </w:tcBorders>
-            <w:tcMar>
-              <w:top w:w="120" w:type="dxa"/>
-              <w:left w:w="180" w:type="dxa"/>
-              <w:bottom w:w="120" w:type="dxa"/>
-              <w:right w:w="180" w:type="dxa"/>
-            </w:tcMar>
-            <w:vAlign w:val="center"/>
-            <w:hideMark/>
-          </w:tcPr>
-          <w:p>
-            <w:r>
-              <w:t>Organiser</w:t>
-            </w:r>
-          </w:p>
-        </w:tc>
-        <w:tc>
-          <w:tcPr>
-            <w:tcW w:w="0" w:type="auto"/>
-            <w:tcBorders>
-              <w:top w:val="single" w:sz="6" w:space="0" w:color="C4C7C5"/>
-              <w:left w:val="single" w:sz="6" w:space="0" w:color="C4C7C5"/>
-              <w:bottom w:val="single" w:sz="6" w:space="0" w:color="C4C7C5"/>
-              <w:right w:val="single" w:sz="6" w:space="0" w:color="C4C7C5"/>
-            </w:tcBorders>
-            <w:tcMar>
-              <w:top w:w="120" w:type="dxa"/>
-              <w:left w:w="180" w:type="dxa"/>
-              <w:bottom w:w="120" w:type="dxa"/>
-              <w:right w:w="180" w:type="dxa"/>
-            </w:tcMar>
-            <w:vAlign w:val="center"/>
-            <w:hideMark/>
-          </w:tcPr>
-          <w:p>
-            <w:r>
-              <w:t>None</w:t>
-            </w:r>
-          </w:p>
-        </w:tc>
-        <w:tc>
-          <w:tcPr>
-            <w:tcW w:w="0" w:type="auto"/>
-            <w:tcBorders>
-              <w:top w:val="single" w:sz="6" w:space="0" w:color="C4C7C5"/>
-              <w:left w:val="single" w:sz="6" w:space="0" w:color="C4C7C5"/>
-              <w:bottom w:val="single" w:sz="6" w:space="0" w:color="C4C7C5"/>
-              <w:right w:val="single" w:sz="6" w:space="0" w:color="C4C7C5"/>
-            </w:tcBorders>
-            <w:tcMar>
-              <w:top w:w="120" w:type="dxa"/>
-              <w:left w:w="180" w:type="dxa"/>
-              <w:bottom w:w="120" w:type="dxa"/>
-              <w:right w:w="180" w:type="dxa"/>
-            </w:tcMar>
-            <w:vAlign w:val="center"/>
-            <w:hideMark/>
-          </w:tcPr>
-          <w:p>
-            <w:r>
-              <w:t>200 OK - Event deleted.</w:t>
-            </w:r>
-          </w:p>
-          <w:p>
-            <w:r>
-              <w:br/>
-            </w:r>
-          </w:p>
-          <w:p>
-            <w:r>
-              <w:t>404 Not Found - Event not found.</w:t>
-            </w:r>
-          </w:p>
-        </w:tc>
-      </w:tr>
-      <w:tr>
-        <w:trPr>
-          <w:tblCellSpacing w:w="15" w:type="dxa"/>
-        </w:trPr>
-        <w:tc>
-          <w:tcPr>
-            <w:tcW w:w="0" w:type="auto"/>
-            <w:tcBorders>
-              <w:top w:val="single" w:sz="6" w:space="0" w:color="C4C7C5"/>
-              <w:left w:val="single" w:sz="6" w:space="0" w:color="C4C7C5"/>
-              <w:bottom w:val="single" w:sz="6" w:space="0" w:color="C4C7C5"/>
-              <w:right w:val="single" w:sz="6" w:space="0" w:color="C4C7C5"/>
-            </w:tcBorders>
-            <w:tcMar>
-              <w:top w:w="120" w:type="dxa"/>
-              <w:left w:w="180" w:type="dxa"/>
-              <w:bottom w:w="120" w:type="dxa"/>
-              <w:right w:w="180" w:type="dxa"/>
-            </w:tcMar>
-            <w:vAlign w:val="center"/>
-            <w:hideMark/>
-          </w:tcPr>
-          <w:p>
-            <w:r>
-              <w:rPr>
-                <w:b/>
-                <w:bCs/>
-              </w:rPr>
               <w:lastRenderedPageBreak/>
-              <w:t>GET</w:t>
-            </w:r>
-          </w:p>
-        </w:tc>
-        <w:tc>
-          <w:tcPr>
-            <w:tcW w:w="0" w:type="auto"/>
-            <w:tcBorders>
-              <w:top w:val="single" w:sz="6" w:space="0" w:color="C4C7C5"/>
-              <w:left w:val="single" w:sz="6" w:space="0" w:color="C4C7C5"/>
-              <w:bottom w:val="single" w:sz="6" w:space="0" w:color="C4C7C5"/>
-              <w:right w:val="single" w:sz="6" w:space="0" w:color="C4C7C5"/>
-            </w:tcBorders>
-            <w:tcMar>
-              <w:top w:w="120" w:type="dxa"/>
-              <w:left w:w="180" w:type="dxa"/>
-              <w:bottom w:w="120" w:type="dxa"/>
-              <w:right w:w="180" w:type="dxa"/>
-            </w:tcMar>
-            <w:vAlign w:val="center"/>
-            <w:hideMark/>
-          </w:tcPr>
-          <w:p>
-            <w:r>
-              <w:t>/</w:t>
-            </w:r>
-            <w:proofErr w:type="spellStart"/>
-            <w:proofErr w:type="gramStart"/>
-            <w:r>
-              <w:t>api</w:t>
-            </w:r>
-            <w:proofErr w:type="spellEnd"/>
-            <w:proofErr w:type="gramEnd"/>
-            <w:r>
-              <w:t>/events/{</w:t>
-            </w:r>
-            <w:proofErr w:type="spellStart"/>
-            <w:r>
-              <w:t>eventId</w:t>
-            </w:r>
-            <w:proofErr w:type="spellEnd"/>
-            <w:r>
-              <w:t>}/categories</w:t>
-            </w:r>
-          </w:p>
-        </w:tc>
-        <w:tc>
-          <w:tcPr>
-            <w:tcW w:w="0" w:type="auto"/>
-            <w:tcBorders>
-              <w:top w:val="single" w:sz="6" w:space="0" w:color="C4C7C5"/>
-              <w:left w:val="single" w:sz="6" w:space="0" w:color="C4C7C5"/>
-              <w:bottom w:val="single" w:sz="6" w:space="0" w:color="C4C7C5"/>
-              <w:right w:val="single" w:sz="6" w:space="0" w:color="C4C7C5"/>
-            </w:tcBorders>
-            <w:tcMar>
-              <w:top w:w="120" w:type="dxa"/>
-              <w:left w:w="180" w:type="dxa"/>
-              <w:bottom w:w="120" w:type="dxa"/>
-              <w:right w:w="180" w:type="dxa"/>
-            </w:tcMar>
-            <w:vAlign w:val="center"/>
-            <w:hideMark/>
-          </w:tcPr>
-          <w:p>
-            <w:r>
-              <w:t>Lists all categories defined for a specific event.</w:t>
-            </w:r>
-          </w:p>
-        </w:tc>
-        <w:tc>
-          <w:tcPr>
-            <w:tcW w:w="0" w:type="auto"/>
-            <w:tcBorders>
-              <w:top w:val="single" w:sz="6" w:space="0" w:color="C4C7C5"/>
-              <w:left w:val="single" w:sz="6" w:space="0" w:color="C4C7C5"/>
-              <w:bottom w:val="single" w:sz="6" w:space="0" w:color="C4C7C5"/>
-              <w:right w:val="single" w:sz="6" w:space="0" w:color="C4C7C5"/>
-            </w:tcBorders>
-            <w:tcMar>
-              <w:top w:w="120" w:type="dxa"/>
-              <w:left w:w="180" w:type="dxa"/>
-              <w:bottom w:w="120" w:type="dxa"/>
-              <w:right w:w="180" w:type="dxa"/>
-            </w:tcMar>
-            <w:vAlign w:val="center"/>
-            <w:hideMark/>
-          </w:tcPr>
-          <w:p>
-            <w:r>
-              <w:t>None</w:t>
-            </w:r>
-          </w:p>
-        </w:tc>
-        <w:tc>
-          <w:tcPr>
-            <w:tcW w:w="0" w:type="auto"/>
-            <w:tcBorders>
-              <w:top w:val="single" w:sz="6" w:space="0" w:color="C4C7C5"/>
-              <w:left w:val="single" w:sz="6" w:space="0" w:color="C4C7C5"/>
-              <w:bottom w:val="single" w:sz="6" w:space="0" w:color="C4C7C5"/>
-              <w:right w:val="single" w:sz="6" w:space="0" w:color="C4C7C5"/>
-            </w:tcBorders>
-            <w:tcMar>
-              <w:top w:w="120" w:type="dxa"/>
-              <w:left w:w="180" w:type="dxa"/>
-              <w:bottom w:w="120" w:type="dxa"/>
-              <w:right w:w="180" w:type="dxa"/>
-            </w:tcMar>
-            <w:vAlign w:val="center"/>
-            <w:hideMark/>
-          </w:tcPr>
-          <w:p>
-            <w:r>
-              <w:t>None</w:t>
-            </w:r>
-          </w:p>
-        </w:tc>
-        <w:tc>
-          <w:tcPr>
-            <w:tcW w:w="0" w:type="auto"/>
-            <w:tcBorders>
-              <w:top w:val="single" w:sz="6" w:space="0" w:color="C4C7C5"/>
-              <w:left w:val="single" w:sz="6" w:space="0" w:color="C4C7C5"/>
-              <w:bottom w:val="single" w:sz="6" w:space="0" w:color="C4C7C5"/>
-              <w:right w:val="single" w:sz="6" w:space="0" w:color="C4C7C5"/>
-            </w:tcBorders>
-            <w:tcMar>
-              <w:top w:w="120" w:type="dxa"/>
-              <w:left w:w="180" w:type="dxa"/>
-              <w:bottom w:w="120" w:type="dxa"/>
-              <w:right w:w="180" w:type="dxa"/>
-            </w:tcMar>
-            <w:vAlign w:val="center"/>
-            <w:hideMark/>
-          </w:tcPr>
-          <w:p>
-            <w:r>
-              <w:t>200 OK - Array of categories.</w:t>
-            </w:r>
-          </w:p>
-          <w:p>
-            <w:r>
-              <w:br/>
-            </w:r>
-          </w:p>
-          <w:p>
-            <w:r>
-              <w:t>404 Not Found - Event not found.</w:t>
-            </w:r>
-          </w:p>
-        </w:tc>
-      </w:tr>
-      <w:tr>
-        <w:trPr>
-          <w:tblCellSpacing w:w="15" w:type="dxa"/>
-        </w:trPr>
-        <w:tc>
-          <w:tcPr>
-            <w:tcW w:w="0" w:type="auto"/>
-            <w:tcBorders>
-              <w:top w:val="single" w:sz="6" w:space="0" w:color="C4C7C5"/>
-              <w:left w:val="single" w:sz="6" w:space="0" w:color="C4C7C5"/>
-              <w:bottom w:val="single" w:sz="6" w:space="0" w:color="C4C7C5"/>
-              <w:right w:val="single" w:sz="6" w:space="0" w:color="C4C7C5"/>
-            </w:tcBorders>
-            <w:tcMar>
-              <w:top w:w="120" w:type="dxa"/>
-              <w:left w:w="180" w:type="dxa"/>
-              <w:bottom w:w="120" w:type="dxa"/>
-              <w:right w:w="180" w:type="dxa"/>
-            </w:tcMar>
-            <w:vAlign w:val="center"/>
-            <w:hideMark/>
-          </w:tcPr>
-          <w:p>
-            <w:r>
-              <w:rPr>
-                <w:b/>
-                <w:bCs/>
-              </w:rPr>
-              <w:t>POST</w:t>
-            </w:r>
-          </w:p>
-        </w:tc>
-        <w:tc>
-          <w:tcPr>
-            <w:tcW w:w="0" w:type="auto"/>
-            <w:tcBorders>
-              <w:top w:val="single" w:sz="6" w:space="0" w:color="C4C7C5"/>
-              <w:left w:val="single" w:sz="6" w:space="0" w:color="C4C7C5"/>
-              <w:bottom w:val="single" w:sz="6" w:space="0" w:color="C4C7C5"/>
-              <w:right w:val="single" w:sz="6" w:space="0" w:color="C4C7C5"/>
-            </w:tcBorders>
-            <w:tcMar>
-              <w:top w:w="120" w:type="dxa"/>
-              <w:left w:w="180" w:type="dxa"/>
-              <w:bottom w:w="120" w:type="dxa"/>
-              <w:right w:w="180" w:type="dxa"/>
-            </w:tcMar>
-            <w:vAlign w:val="center"/>
-            <w:hideMark/>
-          </w:tcPr>
-          <w:p>
-            <w:r>
-              <w:t>/</w:t>
-            </w:r>
-            <w:proofErr w:type="spellStart"/>
-            <w:proofErr w:type="gramStart"/>
-            <w:r>
-              <w:t>api</w:t>
-            </w:r>
-            <w:proofErr w:type="spellEnd"/>
-            <w:proofErr w:type="gramEnd"/>
-            <w:r>
-              <w:t>/events/{</w:t>
-            </w:r>
-            <w:proofErr w:type="spellStart"/>
-            <w:r>
-              <w:t>eventId</w:t>
-            </w:r>
-            <w:proofErr w:type="spellEnd"/>
-            <w:r>
-              <w:t>}/categories</w:t>
-            </w:r>
-          </w:p>
-        </w:tc>
-        <w:tc>
-          <w:tcPr>
-            <w:tcW w:w="0" w:type="auto"/>
-            <w:tcBorders>
-              <w:top w:val="single" w:sz="6" w:space="0" w:color="C4C7C5"/>
-              <w:left w:val="single" w:sz="6" w:space="0" w:color="C4C7C5"/>
-              <w:bottom w:val="single" w:sz="6" w:space="0" w:color="C4C7C5"/>
-              <w:right w:val="single" w:sz="6" w:space="0" w:color="C4C7C5"/>
-            </w:tcBorders>
-            <w:tcMar>
-              <w:top w:w="120" w:type="dxa"/>
-              <w:left w:w="180" w:type="dxa"/>
-              <w:bottom w:w="120" w:type="dxa"/>
-              <w:right w:w="180" w:type="dxa"/>
-            </w:tcMar>
-            <w:vAlign w:val="center"/>
-            <w:hideMark/>
-          </w:tcPr>
-          <w:p>
-            <w:r>
-              <w:t>Adds a new age/distance category to an existing event.</w:t>
-            </w:r>
-          </w:p>
-        </w:tc>
-        <w:tc>
-          <w:tcPr>
-            <w:tcW w:w="0" w:type="auto"/>
-            <w:tcBorders>
-              <w:top w:val="single" w:sz="6" w:space="0" w:color="C4C7C5"/>
-              <w:left w:val="single" w:sz="6" w:space="0" w:color="C4C7C5"/>
-              <w:bottom w:val="single" w:sz="6" w:space="0" w:color="C4C7C5"/>
-              <w:right w:val="single" w:sz="6" w:space="0" w:color="C4C7C5"/>
-            </w:tcBorders>
-            <w:tcMar>
-              <w:top w:w="120" w:type="dxa"/>
-              <w:left w:w="180" w:type="dxa"/>
-              <w:bottom w:w="120" w:type="dxa"/>
-              <w:right w:w="180" w:type="dxa"/>
-            </w:tcMar>
-            <w:vAlign w:val="center"/>
-            <w:hideMark/>
-          </w:tcPr>
-          <w:p>
-            <w:r>
-              <w:t>Organiser</w:t>
-            </w:r>
-          </w:p>
-        </w:tc>
-        <w:tc>
-          <w:tcPr>
-            <w:tcW w:w="0" w:type="auto"/>
-            <w:tcBorders>
-              <w:top w:val="single" w:sz="6" w:space="0" w:color="C4C7C5"/>
-              <w:left w:val="single" w:sz="6" w:space="0" w:color="C4C7C5"/>
-              <w:bottom w:val="single" w:sz="6" w:space="0" w:color="C4C7C5"/>
-              <w:right w:val="single" w:sz="6" w:space="0" w:color="C4C7C5"/>
-            </w:tcBorders>
-            <w:tcMar>
-              <w:top w:w="120" w:type="dxa"/>
-              <w:left w:w="180" w:type="dxa"/>
-              <w:bottom w:w="120" w:type="dxa"/>
-              <w:right w:w="180" w:type="dxa"/>
-            </w:tcMar>
-            <w:vAlign w:val="center"/>
-            <w:hideMark/>
-          </w:tcPr>
-          <w:p>
-            <w:proofErr w:type="gramStart"/>
-            <w:r>
-              <w:t xml:space="preserve">{ </w:t>
-            </w:r>
-            <w:proofErr w:type="spellStart"/>
-            <w:r>
-              <w:t>categoryName</w:t>
-            </w:r>
-            <w:proofErr w:type="spellEnd"/>
-            <w:proofErr w:type="gramEnd"/>
-            <w:r>
-              <w:t xml:space="preserve">, </w:t>
-            </w:r>
-            <w:proofErr w:type="spellStart"/>
-            <w:r>
-              <w:t>minAge</w:t>
-            </w:r>
-            <w:proofErr w:type="spellEnd"/>
-            <w:r>
-              <w:t xml:space="preserve">, </w:t>
-            </w:r>
-            <w:proofErr w:type="spellStart"/>
-            <w:proofErr w:type="gramStart"/>
-            <w:r>
-              <w:t>maxAge</w:t>
-            </w:r>
-            <w:proofErr w:type="spellEnd"/>
-            <w:r>
-              <w:t xml:space="preserve"> }</w:t>
-            </w:r>
-            <w:proofErr w:type="gramEnd"/>
-          </w:p>
-        </w:tc>
-        <w:tc>
-          <w:tcPr>
-            <w:tcW w:w="0" w:type="auto"/>
-            <w:tcBorders>
-              <w:top w:val="single" w:sz="6" w:space="0" w:color="C4C7C5"/>
-              <w:left w:val="single" w:sz="6" w:space="0" w:color="C4C7C5"/>
-              <w:bottom w:val="single" w:sz="6" w:space="0" w:color="C4C7C5"/>
-              <w:right w:val="single" w:sz="6" w:space="0" w:color="C4C7C5"/>
-            </w:tcBorders>
-            <w:tcMar>
-              <w:top w:w="120" w:type="dxa"/>
-              <w:left w:w="180" w:type="dxa"/>
-              <w:bottom w:w="120" w:type="dxa"/>
-              <w:right w:w="180" w:type="dxa"/>
-            </w:tcMar>
-            <w:vAlign w:val="center"/>
-            <w:hideMark/>
-          </w:tcPr>
-          <w:p>
-            <w:r>
-              <w:t>201 Created - Category added.</w:t>
-            </w:r>
-          </w:p>
-          <w:p>
-            <w:r>
-              <w:br/>
-            </w:r>
-          </w:p>
-          <w:p>
-            <w:r>
-              <w:t>400 Bad Request - Invalid age ranges.</w:t>
-            </w:r>
-          </w:p>
-        </w:tc>
-      </w:tr>
-      <w:tr>
-        <w:trPr>
-          <w:tblCellSpacing w:w="15" w:type="dxa"/>
-        </w:trPr>
-        <w:tc>
-          <w:tcPr>
-            <w:tcW w:w="0" w:type="auto"/>
-            <w:tcBorders>
-              <w:top w:val="single" w:sz="6" w:space="0" w:color="C4C7C5"/>
-              <w:left w:val="single" w:sz="6" w:space="0" w:color="C4C7C5"/>
-              <w:bottom w:val="single" w:sz="6" w:space="0" w:color="C4C7C5"/>
-              <w:right w:val="single" w:sz="6" w:space="0" w:color="C4C7C5"/>
-            </w:tcBorders>
-            <w:tcMar>
-              <w:top w:w="120" w:type="dxa"/>
-              <w:left w:w="180" w:type="dxa"/>
-              <w:bottom w:w="120" w:type="dxa"/>
-              <w:right w:w="180" w:type="dxa"/>
-            </w:tcMar>
-            <w:vAlign w:val="center"/>
-            <w:hideMark/>
-          </w:tcPr>
-          <w:p>
-            <w:r>
-              <w:rPr>
-                <w:b/>
-                <w:bCs/>
-              </w:rPr>
-              <w:t>POST</w:t>
-            </w:r>
-          </w:p>
-        </w:tc>
-        <w:tc>
-          <w:tcPr>
-            <w:tcW w:w="0" w:type="auto"/>
-            <w:tcBorders>
-              <w:top w:val="single" w:sz="6" w:space="0" w:color="C4C7C5"/>
-              <w:left w:val="single" w:sz="6" w:space="0" w:color="C4C7C5"/>
-              <w:bottom w:val="single" w:sz="6" w:space="0" w:color="C4C7C5"/>
-              <w:right w:val="single" w:sz="6" w:space="0" w:color="C4C7C5"/>
-            </w:tcBorders>
-            <w:tcMar>
-              <w:top w:w="120" w:type="dxa"/>
-              <w:left w:w="180" w:type="dxa"/>
-              <w:bottom w:w="120" w:type="dxa"/>
-              <w:right w:w="180" w:type="dxa"/>
-            </w:tcMar>
-            <w:vAlign w:val="center"/>
-            <w:hideMark/>
-          </w:tcPr>
-          <w:p>
-            <w:r>
-              <w:t>/</w:t>
-            </w:r>
-            <w:proofErr w:type="spellStart"/>
-            <w:r>
-              <w:t>api</w:t>
-            </w:r>
-            <w:proofErr w:type="spellEnd"/>
-            <w:r>
-              <w:t>/enrolments</w:t>
-            </w:r>
-          </w:p>
-        </w:tc>
-        <w:tc>
-          <w:tcPr>
-            <w:tcW w:w="0" w:type="auto"/>
-            <w:tcBorders>
-              <w:top w:val="single" w:sz="6" w:space="0" w:color="C4C7C5"/>
-              <w:left w:val="single" w:sz="6" w:space="0" w:color="C4C7C5"/>
-              <w:bottom w:val="single" w:sz="6" w:space="0" w:color="C4C7C5"/>
-              <w:right w:val="single" w:sz="6" w:space="0" w:color="C4C7C5"/>
-            </w:tcBorders>
-            <w:tcMar>
-              <w:top w:w="120" w:type="dxa"/>
-              <w:left w:w="180" w:type="dxa"/>
-              <w:bottom w:w="120" w:type="dxa"/>
-              <w:right w:w="180" w:type="dxa"/>
-            </w:tcMar>
-            <w:vAlign w:val="center"/>
-            <w:hideMark/>
-          </w:tcPr>
-          <w:p>
-            <w:r>
-              <w:t>Enrols the logged-in participant into an event category.</w:t>
-            </w:r>
-          </w:p>
-        </w:tc>
-        <w:tc>
-          <w:tcPr>
-            <w:tcW w:w="0" w:type="auto"/>
-            <w:tcBorders>
-              <w:top w:val="single" w:sz="6" w:space="0" w:color="C4C7C5"/>
-              <w:left w:val="single" w:sz="6" w:space="0" w:color="C4C7C5"/>
-              <w:bottom w:val="single" w:sz="6" w:space="0" w:color="C4C7C5"/>
-              <w:right w:val="single" w:sz="6" w:space="0" w:color="C4C7C5"/>
-            </w:tcBorders>
-            <w:tcMar>
-              <w:top w:w="120" w:type="dxa"/>
-              <w:left w:w="180" w:type="dxa"/>
-              <w:bottom w:w="120" w:type="dxa"/>
-              <w:right w:w="180" w:type="dxa"/>
-            </w:tcMar>
-            <w:vAlign w:val="center"/>
-            <w:hideMark/>
-          </w:tcPr>
-          <w:p>
-            <w:r>
-              <w:t>Participant</w:t>
-            </w:r>
-          </w:p>
-        </w:tc>
-        <w:tc>
-          <w:tcPr>
-            <w:tcW w:w="0" w:type="auto"/>
-            <w:tcBorders>
-              <w:top w:val="single" w:sz="6" w:space="0" w:color="C4C7C5"/>
-              <w:left w:val="single" w:sz="6" w:space="0" w:color="C4C7C5"/>
-              <w:bottom w:val="single" w:sz="6" w:space="0" w:color="C4C7C5"/>
-              <w:right w:val="single" w:sz="6" w:space="0" w:color="C4C7C5"/>
-            </w:tcBorders>
-            <w:tcMar>
-              <w:top w:w="120" w:type="dxa"/>
-              <w:left w:w="180" w:type="dxa"/>
-              <w:bottom w:w="120" w:type="dxa"/>
-              <w:right w:w="180" w:type="dxa"/>
-            </w:tcMar>
-            <w:vAlign w:val="center"/>
-            <w:hideMark/>
-          </w:tcPr>
-          <w:p>
-            <w:proofErr w:type="gramStart"/>
-            <w:r>
-              <w:t xml:space="preserve">{ </w:t>
-            </w:r>
-            <w:proofErr w:type="spellStart"/>
-            <w:r>
-              <w:t>categoryId</w:t>
-            </w:r>
-            <w:proofErr w:type="spellEnd"/>
-            <w:proofErr w:type="gramEnd"/>
-            <w:r>
-              <w:t xml:space="preserve"> }</w:t>
-            </w:r>
-          </w:p>
-        </w:tc>
-        <w:tc>
-          <w:tcPr>
-            <w:tcW w:w="0" w:type="auto"/>
-            <w:tcBorders>
-              <w:top w:val="single" w:sz="6" w:space="0" w:color="C4C7C5"/>
-              <w:left w:val="single" w:sz="6" w:space="0" w:color="C4C7C5"/>
-              <w:bottom w:val="single" w:sz="6" w:space="0" w:color="C4C7C5"/>
-              <w:right w:val="single" w:sz="6" w:space="0" w:color="C4C7C5"/>
-            </w:tcBorders>
-            <w:tcMar>
-              <w:top w:w="120" w:type="dxa"/>
-              <w:left w:w="180" w:type="dxa"/>
-              <w:bottom w:w="120" w:type="dxa"/>
-              <w:right w:w="180" w:type="dxa"/>
-            </w:tcMar>
-            <w:vAlign w:val="center"/>
-            <w:hideMark/>
-          </w:tcPr>
-          <w:p>
-            <w:r>
-              <w:t>201 Created - Enrolment completed.</w:t>
-            </w:r>
-          </w:p>
-          <w:p>
-            <w:r>
-              <w:br/>
-            </w:r>
-          </w:p>
-          <w:p>
-            <w:r>
-              <w:t>409 Conflict - Participant already enrolled.</w:t>
-            </w:r>
-          </w:p>
-        </w:tc>
-      </w:tr>
-      <w:tr>
-        <w:trPr>
-          <w:tblCellSpacing w:w="15" w:type="dxa"/>
-        </w:trPr>
-        <w:tc>
-          <w:tcPr>
-            <w:tcW w:w="0" w:type="auto"/>
-            <w:tcBorders>
-              <w:top w:val="single" w:sz="6" w:space="0" w:color="C4C7C5"/>
-              <w:left w:val="single" w:sz="6" w:space="0" w:color="C4C7C5"/>
-              <w:bottom w:val="single" w:sz="6" w:space="0" w:color="C4C7C5"/>
-              <w:right w:val="single" w:sz="6" w:space="0" w:color="C4C7C5"/>
-            </w:tcBorders>
-            <w:tcMar>
-              <w:top w:w="120" w:type="dxa"/>
-              <w:left w:w="180" w:type="dxa"/>
-              <w:bottom w:w="120" w:type="dxa"/>
-              <w:right w:w="180" w:type="dxa"/>
-            </w:tcMar>
-            <w:vAlign w:val="center"/>
-            <w:hideMark/>
-          </w:tcPr>
-          <w:p>
-            <w:r>
-              <w:rPr>
-                <w:b/>
-                <w:bCs/>
-              </w:rPr>
-              <w:t>GET</w:t>
-            </w:r>
-          </w:p>
-        </w:tc>
-        <w:tc>
-          <w:tcPr>
-            <w:tcW w:w="0" w:type="auto"/>
-            <w:tcBorders>
-              <w:top w:val="single" w:sz="6" w:space="0" w:color="C4C7C5"/>
-              <w:left w:val="single" w:sz="6" w:space="0" w:color="C4C7C5"/>
-              <w:bottom w:val="single" w:sz="6" w:space="0" w:color="C4C7C5"/>
-              <w:right w:val="single" w:sz="6" w:space="0" w:color="C4C7C5"/>
-            </w:tcBorders>
-            <w:tcMar>
-              <w:top w:w="120" w:type="dxa"/>
-              <w:left w:w="180" w:type="dxa"/>
-              <w:bottom w:w="120" w:type="dxa"/>
-              <w:right w:w="180" w:type="dxa"/>
-            </w:tcMar>
-            <w:vAlign w:val="center"/>
-            <w:hideMark/>
-          </w:tcPr>
-          <w:p>
-            <w:r>
-              <w:t>/</w:t>
-            </w:r>
-            <w:proofErr w:type="spellStart"/>
-            <w:proofErr w:type="gramStart"/>
-            <w:r>
-              <w:t>api</w:t>
-            </w:r>
-            <w:proofErr w:type="spellEnd"/>
-            <w:proofErr w:type="gramEnd"/>
-            <w:r>
-              <w:t>/events/{</w:t>
-            </w:r>
-            <w:proofErr w:type="spellStart"/>
-            <w:r>
-              <w:t>eventId</w:t>
-            </w:r>
-            <w:proofErr w:type="spellEnd"/>
-            <w:r>
-              <w:t>}/enrolments</w:t>
-            </w:r>
-          </w:p>
-        </w:tc>
-        <w:tc>
-          <w:tcPr>
-            <w:tcW w:w="0" w:type="auto"/>
-            <w:tcBorders>
-              <w:top w:val="single" w:sz="6" w:space="0" w:color="C4C7C5"/>
-              <w:left w:val="single" w:sz="6" w:space="0" w:color="C4C7C5"/>
-              <w:bottom w:val="single" w:sz="6" w:space="0" w:color="C4C7C5"/>
-              <w:right w:val="single" w:sz="6" w:space="0" w:color="C4C7C5"/>
-            </w:tcBorders>
-            <w:tcMar>
-              <w:top w:w="120" w:type="dxa"/>
-              <w:left w:w="180" w:type="dxa"/>
-              <w:bottom w:w="120" w:type="dxa"/>
-              <w:right w:w="180" w:type="dxa"/>
-            </w:tcMar>
-            <w:vAlign w:val="center"/>
-            <w:hideMark/>
-          </w:tcPr>
-          <w:p>
-            <w:r>
-              <w:t xml:space="preserve">Fetches all participant </w:t>
-            </w:r>
-            <w:r>
-              <w:lastRenderedPageBreak/>
-              <w:t>enrolments for a given event.</w:t>
-            </w:r>
-          </w:p>
-        </w:tc>
-        <w:tc>
-          <w:tcPr>
-            <w:tcW w:w="0" w:type="auto"/>
-            <w:tcBorders>
-              <w:top w:val="single" w:sz="6" w:space="0" w:color="C4C7C5"/>
-              <w:left w:val="single" w:sz="6" w:space="0" w:color="C4C7C5"/>
-              <w:bottom w:val="single" w:sz="6" w:space="0" w:color="C4C7C5"/>
-              <w:right w:val="single" w:sz="6" w:space="0" w:color="C4C7C5"/>
-            </w:tcBorders>
-            <w:tcMar>
-              <w:top w:w="120" w:type="dxa"/>
-              <w:left w:w="180" w:type="dxa"/>
-              <w:bottom w:w="120" w:type="dxa"/>
-              <w:right w:w="180" w:type="dxa"/>
-            </w:tcMar>
-            <w:vAlign w:val="center"/>
-            <w:hideMark/>
-          </w:tcPr>
-          <w:p>
-            <w:r>
-              <w:lastRenderedPageBreak/>
-              <w:t>Organiser</w:t>
-            </w:r>
-          </w:p>
-        </w:tc>
-        <w:tc>
-          <w:tcPr>
-            <w:tcW w:w="0" w:type="auto"/>
-            <w:tcBorders>
-              <w:top w:val="single" w:sz="6" w:space="0" w:color="C4C7C5"/>
-              <w:left w:val="single" w:sz="6" w:space="0" w:color="C4C7C5"/>
-              <w:bottom w:val="single" w:sz="6" w:space="0" w:color="C4C7C5"/>
-              <w:right w:val="single" w:sz="6" w:space="0" w:color="C4C7C5"/>
-            </w:tcBorders>
-            <w:tcMar>
-              <w:top w:w="120" w:type="dxa"/>
-              <w:left w:w="180" w:type="dxa"/>
-              <w:bottom w:w="120" w:type="dxa"/>
-              <w:right w:w="180" w:type="dxa"/>
-            </w:tcMar>
-            <w:vAlign w:val="center"/>
-            <w:hideMark/>
-          </w:tcPr>
-          <w:p>
-            <w:r>
-              <w:t>None</w:t>
-            </w:r>
-          </w:p>
-        </w:tc>
-        <w:tc>
-          <w:tcPr>
-            <w:tcW w:w="0" w:type="auto"/>
-            <w:tcBorders>
-              <w:top w:val="single" w:sz="6" w:space="0" w:color="C4C7C5"/>
-              <w:left w:val="single" w:sz="6" w:space="0" w:color="C4C7C5"/>
-              <w:bottom w:val="single" w:sz="6" w:space="0" w:color="C4C7C5"/>
-              <w:right w:val="single" w:sz="6" w:space="0" w:color="C4C7C5"/>
-            </w:tcBorders>
-            <w:tcMar>
-              <w:top w:w="120" w:type="dxa"/>
-              <w:left w:w="180" w:type="dxa"/>
-              <w:bottom w:w="120" w:type="dxa"/>
-              <w:right w:w="180" w:type="dxa"/>
-            </w:tcMar>
-            <w:vAlign w:val="center"/>
-            <w:hideMark/>
-          </w:tcPr>
-          <w:p>
-            <w:r>
-              <w:t xml:space="preserve">200 OK - List of enrolled </w:t>
-            </w:r>
-            <w:r>
-              <w:lastRenderedPageBreak/>
-              <w:t>participants.</w:t>
-            </w:r>
-          </w:p>
-          <w:p>
-            <w:r>
-              <w:br/>
-            </w:r>
-          </w:p>
-          <w:p>
-            <w:r>
               <w:t>403 Forbidden - Not event owner.</w:t>
             </w:r>
           </w:p>
@@ -3289,11 +3163,7 @@
               <w:t xml:space="preserve"> </w:t>
             </w:r>
             <w:r>
-              <w:t xml:space="preserve">404 Not Found- Route </w:t>
-            </w:r>
-            <w:r>
-              <w:lastRenderedPageBreak/>
-              <w:t>Unavail</w:t>
+              <w:t>404 Not Found- Route Unavail</w:t>
             </w:r>
             <w:r>
               <w:t>a</w:t>
@@ -3307,7 +3177,7 @@
     </w:tbl>
     <w:p/>
     <w:sectPr>
-      <w:pgSz w:w="11906" w:h="16838"/>
+      <w:pgSz w:w="16838" w:h="11906" w:orient="landscape"/>
       <w:pgMar w:top="1440" w:right="1440" w:bottom="1440" w:left="1440" w:header="708" w:footer="708" w:gutter="0"/>
       <w:cols w:space="708"/>
       <w:docGrid w:linePitch="360"/>
@@ -3744,7 +3614,6 @@
     <w:next w:val="Normal"/>
     <w:link w:val="Heading2Char"/>
     <w:uiPriority w:val="9"/>
-    <w:semiHidden/>
     <w:unhideWhenUsed/>
     <w:qFormat/>
     <w:rsid w:val="009A00C5"/>
@@ -3960,7 +3829,6 @@
     <w:basedOn w:val="DefaultParagraphFont"/>
     <w:link w:val="Heading2"/>
     <w:uiPriority w:val="9"/>
-    <w:semiHidden/>
     <w:rsid w:val="009A00C5"/>
     <w:rPr>
       <w:rFonts w:asciiTheme="majorHAnsi" w:eastAsiaTheme="majorEastAsia" w:hAnsiTheme="majorHAnsi" w:cstheme="majorBidi"/>

</xml_diff>